<commit_message>
docs: Word document v3.1 covers both BFF implementations (APIM and Python)
Mode-neutral BFF wording throughout; section 8 now describes both
implementations: shared controls, policy <-> Python mapping, OBO exchange
in Python, code-mode architecture and id-bff roles, how to choose a mode.
Updated flow and sequence figures.

Co-authored-by: Copilot <223556219+Copilot@users.noreply.github.com>
</commit_message>
<xml_diff>
--- a/docs/Authentification-principes.docx
+++ b/docs/Authentification-principes.docx
@@ -27,7 +27,7 @@
           <w:sz w:val="26"/>
           <w:szCs w:val="26"/>
         </w:rPr>
-        <w:t xml:space="preserve">Application mobile → Azure API Management → Agent hébergé Microsoft Foundry → Serveur MCP, avec myID (Keycloak) et échange de jeton On-Behalf-Of</w:t>
+        <w:t xml:space="preserve">Application mobile → BFF (Azure API Management ou service Python) → Agent hébergé Microsoft Foundry → Serveur MCP, avec myID (Keycloak) et échange de jeton On-Behalf-Of</w:t>
       </w:r>
     </w:p>
     <w:p>
@@ -43,7 +43,7 @@
           <w:sz w:val="20"/>
           <w:szCs w:val="20"/>
         </w:rPr>
-        <w:t xml:space="preserve">Principes d'authentification · Version 3.0 (Keycloak / OBO / APIM) · Septembre 2026</w:t>
+        <w:t xml:space="preserve">Principes d'authentification · Version 3.1 (Keycloak / OBO / BFF API Management ou Python) · Octobre 2026</w:t>
       </w:r>
     </w:p>
     <w:p>
@@ -117,17 +117,7 @@
         <w:t xml:space="preserve">BFF</w:t>
       </w:r>
       <w:r>
-        <w:t xml:space="preserve">, implémenté par </w:t>
-      </w:r>
-      <w:r>
-        <w:rPr>
-          <w:b/>
-          <w:bCs/>
-        </w:rPr>
-        <w:t xml:space="preserve">Azure API Management</w:t>
-      </w:r>
-      <w:r>
-        <w:t xml:space="preserve"> (policies, sans code applicatif) et client confidentiel de myID, échange ce jeton contre un jeton destiné au serveur MCP (</w:t>
+        <w:t xml:space="preserve">, client confidentiel de myID, échange ce jeton contre un jeton destiné au serveur MCP (</w:t>
       </w:r>
       <w:r>
         <w:rPr>
@@ -160,6 +150,75 @@
       </w:r>
       <w:r>
         <w:t xml:space="preserve">).</w:t>
+      </w:r>
+    </w:p>
+    <w:p>
+      <w:pPr>
+        <w:pBdr>
+          <w:left w:val="single" w:color="1F3864" w:sz="24" w:space="8"/>
+        </w:pBdr>
+        <w:shd w:fill="EEF2F9" w:color="auto" w:val="clear"/>
+        <w:spacing w:after="0" w:before="0" w:line="290"/>
+        <w:ind w:left="200" w:right="200"/>
+      </w:pPr>
+      <w:r>
+        <w:t xml:space="preserve">Le jeton MCP rejoint l'agent hébergé par un en-tête </w:t>
+      </w:r>
+      <w:r>
+        <w:rPr>
+          <w:rFonts w:ascii="Consolas" w:cs="Consolas" w:eastAsia="Consolas" w:hAnsi="Consolas"/>
+          <w:color w:val="8430CE"/>
+          <w:sz w:val="20"/>
+          <w:szCs w:val="20"/>
+        </w:rPr>
+        <w:t xml:space="preserve">x-client-*</w:t>
+      </w:r>
+      <w:r>
+        <w:t xml:space="preserve">. Le serveur MCP n'accepte que les jetons </w:t>
+      </w:r>
+      <w:r>
+        <w:rPr>
+          <w:b/>
+          <w:bCs/>
+        </w:rPr>
+        <w:t xml:space="preserve">obtenus par le BFF</w:t>
+      </w:r>
+      <w:r>
+        <w:t xml:space="preserve"> (</w:t>
+      </w:r>
+      <w:r>
+        <w:rPr>
+          <w:rFonts w:ascii="Consolas" w:cs="Consolas" w:eastAsia="Consolas" w:hAnsi="Consolas"/>
+          <w:color w:val="8430CE"/>
+          <w:sz w:val="20"/>
+          <w:szCs w:val="20"/>
+        </w:rPr>
+        <w:t xml:space="preserve">azp</w:t>
+      </w:r>
+      <w:r>
+        <w:t xml:space="preserve">) et identifie l'utilisateur par </w:t>
+      </w:r>
+      <w:r>
+        <w:rPr>
+          <w:rFonts w:ascii="Consolas" w:cs="Consolas" w:eastAsia="Consolas" w:hAnsi="Consolas"/>
+          <w:color w:val="8430CE"/>
+          <w:sz w:val="20"/>
+          <w:szCs w:val="20"/>
+        </w:rPr>
+        <w:t xml:space="preserve">sub</w:t>
+      </w:r>
+      <w:r>
+        <w:t xml:space="preserve">. Le modèle de langage ne voit </w:t>
+      </w:r>
+      <w:r>
+        <w:rPr>
+          <w:b/>
+          <w:bCs/>
+        </w:rPr>
+        <w:t xml:space="preserve">jamais</w:t>
+      </w:r>
+      <w:r>
+        <w:t xml:space="preserve"> de jeton.</w:t>
       </w:r>
     </w:p>
     <w:p>
@@ -172,7 +231,17 @@
         <w:ind w:left="200" w:right="200"/>
       </w:pPr>
       <w:r>
-        <w:t xml:space="preserve">Le jeton MCP rejoint l'agent hébergé par un en-tête </w:t>
+        <w:t xml:space="preserve">Le BFF existe en </w:t>
+      </w:r>
+      <w:r>
+        <w:rPr>
+          <w:b/>
+          <w:bCs/>
+        </w:rPr>
+        <w:t xml:space="preserve">deux implémentations interchangeables</w:t>
+      </w:r>
+      <w:r>
+        <w:t xml:space="preserve">, choisies au déploiement (</w:t>
       </w:r>
       <w:r>
         <w:rPr>
@@ -181,54 +250,30 @@
           <w:sz w:val="20"/>
           <w:szCs w:val="20"/>
         </w:rPr>
-        <w:t xml:space="preserve">x-client-*</w:t>
-      </w:r>
-      <w:r>
-        <w:t xml:space="preserve">. Le serveur MCP n'accepte que les jetons </w:t>
+        <w:t xml:space="preserve">BFF_MODE</w:t>
+      </w:r>
+      <w:r>
+        <w:t xml:space="preserve">) : une API d'</w:t>
       </w:r>
       <w:r>
         <w:rPr>
           <w:b/>
           <w:bCs/>
         </w:rPr>
-        <w:t xml:space="preserve">obtenus par le BFF</w:t>
-      </w:r>
-      <w:r>
-        <w:t xml:space="preserve"> (</w:t>
-      </w:r>
-      <w:r>
-        <w:rPr>
-          <w:rFonts w:ascii="Consolas" w:cs="Consolas" w:eastAsia="Consolas" w:hAnsi="Consolas"/>
-          <w:color w:val="8430CE"/>
-          <w:sz w:val="20"/>
-          <w:szCs w:val="20"/>
-        </w:rPr>
-        <w:t xml:space="preserve">azp</w:t>
-      </w:r>
-      <w:r>
-        <w:t xml:space="preserve">) et identifie l'utilisateur par </w:t>
-      </w:r>
-      <w:r>
-        <w:rPr>
-          <w:rFonts w:ascii="Consolas" w:cs="Consolas" w:eastAsia="Consolas" w:hAnsi="Consolas"/>
-          <w:color w:val="8430CE"/>
-          <w:sz w:val="20"/>
-          <w:szCs w:val="20"/>
-        </w:rPr>
-        <w:t xml:space="preserve">sub</w:t>
-      </w:r>
-      <w:r>
-        <w:t xml:space="preserve">. Le modèle de langage ne voit </w:t>
+        <w:t xml:space="preserve">Azure API Management</w:t>
+      </w:r>
+      <w:r>
+        <w:t xml:space="preserve"> (policies, sans code applicatif) ou un </w:t>
       </w:r>
       <w:r>
         <w:rPr>
           <w:b/>
           <w:bCs/>
         </w:rPr>
-        <w:t xml:space="preserve">jamais</w:t>
-      </w:r>
-      <w:r>
-        <w:t xml:space="preserve"> de jeton.</w:t>
+        <w:t xml:space="preserve">service Python</w:t>
+      </w:r>
+      <w:r>
+        <w:t xml:space="preserve"> (FastAPI, Container App). Même contrat, mêmes contrôles dans le même ordre, mêmes tests de sécurité (section 8).</w:t>
       </w:r>
     </w:p>
     <w:p>
@@ -447,7 +492,7 @@
         <w:t xml:space="preserve">Entra ID authentifie des services</w:t>
       </w:r>
       <w:r>
-        <w:t xml:space="preserve"> : le BFF (API Management), qui parle à Foundry avec une identité managée dédiée. </w:t>
+        <w:t xml:space="preserve"> : le BFF (API Management ou service Python), qui parle à Foundry avec une identité managée dédiée. </w:t>
       </w:r>
       <w:r>
         <w:rPr>
@@ -935,17 +980,7 @@
         <w:t xml:space="preserve">dédiée</w:t>
       </w:r>
       <w:r>
-        <w:t xml:space="preserve"> de l'API « chat » d'API Management (distincte de celle qui lit Key Vault) ne reçoit que ce dont elle a besoin : invoquer l'agent (rôle </w:t>
-      </w:r>
-      <w:r>
-        <w:rPr>
-          <w:i/>
-          <w:iCs/>
-        </w:rPr>
-        <w:t xml:space="preserve">Foundry Agent Consumer</w:t>
-      </w:r>
-      <w:r>
-        <w:t xml:space="preserve">) et déléguer l'identité utilisateur (rôle personnalisé limité à </w:t>
+        <w:t xml:space="preserve"> du BFF (</w:t>
       </w:r>
       <w:r>
         <w:rPr>
@@ -954,10 +989,10 @@
           <w:sz w:val="20"/>
           <w:szCs w:val="20"/>
         </w:rPr>
-        <w:t xml:space="preserve">UserIdentityImpersonation</w:t>
-      </w:r>
-      <w:r>
-        <w:t xml:space="preserve">). Côté myID, le client </w:t>
+        <w:t xml:space="preserve">id-apim-chat</w:t>
+      </w:r>
+      <w:r>
+        <w:t xml:space="preserve"> pour l'API « chat » d'API Management, </w:t>
       </w:r>
       <w:r>
         <w:rPr>
@@ -966,20 +1001,64 @@
           <w:sz w:val="20"/>
           <w:szCs w:val="20"/>
         </w:rPr>
-        <w:t xml:space="preserve">weather-bff</w:t>
-      </w:r>
-      <w:r>
-        <w:t xml:space="preserve"> n'a </w:t>
+        <w:t xml:space="preserve">id-bff</w:t>
+      </w:r>
+      <w:r>
+        <w:t xml:space="preserve"> pour le service Python) ne reçoit que ce dont elle a besoin : invoquer l'agent (rôle </w:t>
+      </w:r>
+      <w:r>
+        <w:rPr>
+          <w:i/>
+          <w:iCs/>
+        </w:rPr>
+        <w:t xml:space="preserve">Foundry Agent Consumer</w:t>
+      </w:r>
+      <w:r>
+        <w:t xml:space="preserve">) et déléguer l'identité utilisateur (rôle personnalisé limité à </w:t>
+      </w:r>
+      <w:r>
+        <w:rPr>
+          <w:rFonts w:ascii="Consolas" w:cs="Consolas" w:eastAsia="Consolas" w:hAnsi="Consolas"/>
+          <w:color w:val="8430CE"/>
+          <w:sz w:val="20"/>
+          <w:szCs w:val="20"/>
+        </w:rPr>
+        <w:t xml:space="preserve">UserIdentityImpersonation</w:t>
+      </w:r>
+      <w:r>
+        <w:t xml:space="preserve">). </w:t>
       </w:r>
       <w:r>
         <w:rPr>
           <w:b/>
           <w:bCs/>
         </w:rPr>
+        <w:t xml:space="preserve">Une seule implémentation est déployée par environnement</w:t>
+      </w:r>
+      <w:r>
+        <w:t xml:space="preserve"> : seule son identité détient ce droit. Côté myID, le client </w:t>
+      </w:r>
+      <w:r>
+        <w:rPr>
+          <w:rFonts w:ascii="Consolas" w:cs="Consolas" w:eastAsia="Consolas" w:hAnsi="Consolas"/>
+          <w:color w:val="8430CE"/>
+          <w:sz w:val="20"/>
+          <w:szCs w:val="20"/>
+        </w:rPr>
+        <w:t xml:space="preserve">weather-bff</w:t>
+      </w:r>
+      <w:r>
+        <w:t xml:space="preserve"> n'a </w:t>
+      </w:r>
+      <w:r>
+        <w:rPr>
+          <w:b/>
+          <w:bCs/>
+        </w:rPr>
         <w:t xml:space="preserve">aucun flux interactif</w:t>
       </w:r>
       <w:r>
-        <w:t xml:space="preserve"> : il ne sert qu'à l'échange de jetons. Son secret est stocké dans Azure Key Vault et lu par APIM via une </w:t>
+        <w:t xml:space="preserve"> : il ne sert qu'à l'échange de jetons. Son secret est stocké dans Azure Key Vault et lu par le BFF seul (</w:t>
       </w:r>
       <w:r>
         <w:rPr>
@@ -989,7 +1068,7 @@
         <w:t xml:space="preserve">named value</w:t>
       </w:r>
       <w:r>
-        <w:t xml:space="preserve"> ; en production, il est remplacé par un JWT signé (</w:t>
+        <w:t xml:space="preserve"> APIM ou référence Key Vault de la Container App) ; en production, il est remplacé par un JWT signé (</w:t>
       </w:r>
       <w:r>
         <w:rPr>
@@ -1523,7 +1602,7 @@
                 <w:sz w:val="19"/>
                 <w:szCs w:val="19"/>
               </w:rPr>
-              <w:t xml:space="preserve">BFF = API Management</w:t>
+              <w:t xml:space="preserve">BFF</w:t>
             </w:r>
           </w:p>
           <w:p>
@@ -1537,7 +1616,32 @@
                 <w:sz w:val="19"/>
                 <w:szCs w:val="19"/>
               </w:rPr>
-              <w:t xml:space="preserve">(API « chat »)</w:t>
+              <w:t xml:space="preserve">API Management (API « chat »)</w:t>
+            </w:r>
+          </w:p>
+          <w:p>
+            <w:pPr>
+              <w:spacing w:after="40" w:line="260"/>
+            </w:pPr>
+            <w:r>
+              <w:rPr>
+                <w:b/>
+                <w:bCs/>
+                <w:sz w:val="19"/>
+                <w:szCs w:val="19"/>
+              </w:rPr>
+              <w:t xml:space="preserve">ou service Python </w:t>
+            </w:r>
+            <w:r>
+              <w:rPr>
+                <w:rFonts w:ascii="Consolas" w:cs="Consolas" w:eastAsia="Consolas" w:hAnsi="Consolas"/>
+                <w:b/>
+                <w:bCs/>
+                <w:color w:val="8430CE"/>
+                <w:sz w:val="19"/>
+                <w:szCs w:val="19"/>
+              </w:rPr>
+              <w:t xml:space="preserve">ca-bff</w:t>
             </w:r>
           </w:p>
         </w:tc>
@@ -1568,7 +1672,7 @@
                 <w:sz w:val="19"/>
                 <w:szCs w:val="19"/>
               </w:rPr>
-              <w:t xml:space="preserve">Passerelle publique (de confiance)</w:t>
+              <w:t xml:space="preserve">Point d'entrée public (de confiance)</w:t>
             </w:r>
           </w:p>
         </w:tc>
@@ -1637,7 +1741,47 @@
                 <w:sz w:val="19"/>
                 <w:szCs w:val="19"/>
               </w:rPr>
-              <w:t xml:space="preserve"> + identité managée dédiée</w:t>
+              <w:t xml:space="preserve"> + identité managée dédiée (</w:t>
+            </w:r>
+            <w:r>
+              <w:rPr>
+                <w:rFonts w:ascii="Consolas" w:cs="Consolas" w:eastAsia="Consolas" w:hAnsi="Consolas"/>
+                <w:b w:val="false"/>
+                <w:bCs w:val="false"/>
+                <w:color w:val="8430CE"/>
+                <w:sz w:val="19"/>
+                <w:szCs w:val="19"/>
+              </w:rPr>
+              <w:t xml:space="preserve">id-apim-chat</w:t>
+            </w:r>
+            <w:r>
+              <w:rPr>
+                <w:b w:val="false"/>
+                <w:bCs w:val="false"/>
+                <w:sz w:val="19"/>
+                <w:szCs w:val="19"/>
+              </w:rPr>
+              <w:t xml:space="preserve"> ou </w:t>
+            </w:r>
+            <w:r>
+              <w:rPr>
+                <w:rFonts w:ascii="Consolas" w:cs="Consolas" w:eastAsia="Consolas" w:hAnsi="Consolas"/>
+                <w:b w:val="false"/>
+                <w:bCs w:val="false"/>
+                <w:color w:val="8430CE"/>
+                <w:sz w:val="19"/>
+                <w:szCs w:val="19"/>
+              </w:rPr>
+              <w:t xml:space="preserve">id-bff</w:t>
+            </w:r>
+            <w:r>
+              <w:rPr>
+                <w:b w:val="false"/>
+                <w:bCs w:val="false"/>
+                <w:sz w:val="19"/>
+                <w:szCs w:val="19"/>
+              </w:rPr>
+              <w:t xml:space="preserve">)</w:t>
             </w:r>
           </w:p>
         </w:tc>
@@ -1798,7 +1942,7 @@
                 <w:sz w:val="19"/>
                 <w:szCs w:val="19"/>
               </w:rPr>
-              <w:t xml:space="preserve">Émet le jeton E pour l'identité dédiée d'APIM</w:t>
+              <w:t xml:space="preserve">Émet le jeton E pour l'identité dédiée du BFF</w:t>
             </w:r>
           </w:p>
         </w:tc>
@@ -2651,7 +2795,7 @@
                 <w:sz w:val="19"/>
                 <w:szCs w:val="19"/>
               </w:rPr>
-              <w:t xml:space="preserve">App → APIM</w:t>
+              <w:t xml:space="preserve">App → BFF</w:t>
             </w:r>
           </w:p>
         </w:tc>
@@ -2709,7 +2853,7 @@
                 <w:sz w:val="19"/>
                 <w:szCs w:val="19"/>
               </w:rPr>
-              <w:t xml:space="preserve">APIM</w:t>
+              <w:t xml:space="preserve">BFF</w:t>
             </w:r>
           </w:p>
         </w:tc>
@@ -2868,7 +3012,7 @@
                 <w:sz w:val="19"/>
                 <w:szCs w:val="19"/>
               </w:rPr>
-              <w:t xml:space="preserve">APIM → Foundry → agent → MCP</w:t>
+              <w:t xml:space="preserve">BFF → Foundry → agent → MCP</w:t>
             </w:r>
           </w:p>
         </w:tc>
@@ -2928,7 +3072,7 @@
                 <w:sz w:val="19"/>
                 <w:szCs w:val="19"/>
               </w:rPr>
-              <w:t xml:space="preserve">APIM, agent, MCP</w:t>
+              <w:t xml:space="preserve">BFF, agent, MCP</w:t>
             </w:r>
           </w:p>
         </w:tc>
@@ -3053,7 +3197,7 @@
                 <w:sz w:val="19"/>
                 <w:szCs w:val="19"/>
               </w:rPr>
-              <w:t xml:space="preserve">APIM (MI dédiée)</w:t>
+              <w:t xml:space="preserve">BFF (MI dédiée)</w:t>
             </w:r>
           </w:p>
         </w:tc>
@@ -3082,7 +3226,7 @@
                 <w:sz w:val="19"/>
                 <w:szCs w:val="19"/>
               </w:rPr>
-              <w:t xml:space="preserve">APIM → Foundry</w:t>
+              <w:t xml:space="preserve">BFF → Foundry</w:t>
             </w:r>
           </w:p>
         </w:tc>
@@ -3408,7 +3552,7 @@
         <w:t xml:space="preserve">identifiant opaque et stable</w:t>
       </w:r>
       <w:r>
-        <w:t xml:space="preserve"> calculé par APIM : </w:t>
+        <w:t xml:space="preserve"> calculé par le BFF : </w:t>
       </w:r>
       <w:r>
         <w:rPr>
@@ -5122,7 +5266,7 @@
         <w:pStyle w:val="Heading1"/>
       </w:pPr>
       <w:r>
-        <w:t xml:space="preserve">8. Le BFF implémenté par Azure API Management</w:t>
+        <w:t xml:space="preserve">8. Le BFF : deux implémentations interchangeables</w:t>
       </w:r>
     </w:p>
     <w:p>
@@ -5130,7 +5274,31 @@
         <w:spacing w:after="120" w:line="290"/>
       </w:pPr>
       <w:r>
-        <w:t xml:space="preserve">Le BFF n'est pas un service codé : c'est une API (« chat ») d'</w:t>
+        <w:t xml:space="preserve">Le BFF est choisi au déploiement par la variable </w:t>
+      </w:r>
+      <w:r>
+        <w:rPr>
+          <w:rFonts w:ascii="Consolas" w:cs="Consolas" w:eastAsia="Consolas" w:hAnsi="Consolas"/>
+          <w:color w:val="8430CE"/>
+          <w:sz w:val="20"/>
+          <w:szCs w:val="20"/>
+        </w:rPr>
+        <w:t xml:space="preserve">BFF_MODE</w:t>
+      </w:r>
+      <w:r>
+        <w:t xml:space="preserve"> : </w:t>
+      </w:r>
+      <w:r>
+        <w:rPr>
+          <w:rFonts w:ascii="Consolas" w:cs="Consolas" w:eastAsia="Consolas" w:hAnsi="Consolas"/>
+          <w:color w:val="8430CE"/>
+          <w:sz w:val="20"/>
+          <w:szCs w:val="20"/>
+        </w:rPr>
+        <w:t xml:space="preserve">apim</w:t>
+      </w:r>
+      <w:r>
+        <w:t xml:space="preserve"> (défaut) déploie une API (« chat ») d'</w:t>
       </w:r>
       <w:r>
         <w:rPr>
@@ -5140,7 +5308,7 @@
         <w:t xml:space="preserve">Azure API Management</w:t>
       </w:r>
       <w:r>
-        <w:t xml:space="preserve">, dont les </w:t>
+        <w:t xml:space="preserve"> dont les </w:t>
       </w:r>
       <w:r>
         <w:rPr>
@@ -5150,7 +5318,85 @@
         <w:t xml:space="preserve">policies</w:t>
       </w:r>
       <w:r>
-        <w:t xml:space="preserve"> enchaînent les contrôles ci-dessous. Chaque étape échoue de façon </w:t>
+        <w:t xml:space="preserve"> enchaînent les contrôles ; </w:t>
+      </w:r>
+      <w:r>
+        <w:rPr>
+          <w:rFonts w:ascii="Consolas" w:cs="Consolas" w:eastAsia="Consolas" w:hAnsi="Consolas"/>
+          <w:color w:val="8430CE"/>
+          <w:sz w:val="20"/>
+          <w:szCs w:val="20"/>
+        </w:rPr>
+        <w:t xml:space="preserve">code</w:t>
+      </w:r>
+      <w:r>
+        <w:t xml:space="preserve"> déploie à la place un </w:t>
+      </w:r>
+      <w:r>
+        <w:rPr>
+          <w:b/>
+          <w:bCs/>
+        </w:rPr>
+        <w:t xml:space="preserve">service Python</w:t>
+      </w:r>
+      <w:r>
+        <w:t xml:space="preserve"> (FastAPI) dans la Container App </w:t>
+      </w:r>
+      <w:r>
+        <w:rPr>
+          <w:rFonts w:ascii="Consolas" w:cs="Consolas" w:eastAsia="Consolas" w:hAnsi="Consolas"/>
+          <w:color w:val="8430CE"/>
+          <w:sz w:val="20"/>
+          <w:szCs w:val="20"/>
+        </w:rPr>
+        <w:t xml:space="preserve">ca-bff</w:t>
+      </w:r>
+      <w:r>
+        <w:t xml:space="preserve">. Les deux exposent </w:t>
+      </w:r>
+      <w:r>
+        <w:rPr>
+          <w:b/>
+          <w:bCs/>
+        </w:rPr>
+        <w:t xml:space="preserve">le même contrat</w:t>
+      </w:r>
+      <w:r>
+        <w:t xml:space="preserve"> (</w:t>
+      </w:r>
+      <w:r>
+        <w:rPr>
+          <w:rFonts w:ascii="Consolas" w:cs="Consolas" w:eastAsia="Consolas" w:hAnsi="Consolas"/>
+          <w:color w:val="8430CE"/>
+          <w:sz w:val="20"/>
+          <w:szCs w:val="20"/>
+        </w:rPr>
+        <w:t xml:space="preserve">POST /chat/responses</w:t>
+      </w:r>
+      <w:r>
+        <w:t xml:space="preserve">, </w:t>
+      </w:r>
+      <w:r>
+        <w:rPr>
+          <w:rFonts w:ascii="Consolas" w:cs="Consolas" w:eastAsia="Consolas" w:hAnsi="Consolas"/>
+          <w:color w:val="8430CE"/>
+          <w:sz w:val="20"/>
+          <w:szCs w:val="20"/>
+        </w:rPr>
+        <w:t xml:space="preserve">GET /chat/me</w:t>
+      </w:r>
+      <w:r>
+        <w:t xml:space="preserve">, mêmes codes d'erreur) et appliquent </w:t>
+      </w:r>
+      <w:r>
+        <w:rPr>
+          <w:b/>
+          <w:bCs/>
+        </w:rPr>
+        <w:t xml:space="preserve">les mêmes contrôles dans le même ordre</w:t>
+      </w:r>
+      <w:r>
+        <w:t xml:space="preserve">. Chaque étape échoue de façon </w:t>
       </w:r>
       <w:r>
         <w:rPr>
@@ -5213,7 +5459,7 @@
                 <w:sz w:val="19"/>
                 <w:szCs w:val="19"/>
               </w:rPr>
-              <w:t xml:space="preserve">Étape (policy)</w:t>
+              <w:t xml:space="preserve">Étape</w:t>
             </w:r>
           </w:p>
         </w:tc>
@@ -5596,7 +5842,7 @@
                 <w:sz w:val="19"/>
                 <w:szCs w:val="19"/>
               </w:rPr>
-              <w:t xml:space="preserve"> est rejeté : ces valeurs ne sont calculées que par la passerelle</w:t>
+              <w:t xml:space="preserve"> est rejeté : ces valeurs ne sont calculées que par le BFF</w:t>
             </w:r>
           </w:p>
         </w:tc>
@@ -5661,27 +5907,7 @@
                 <w:sz w:val="19"/>
                 <w:szCs w:val="19"/>
               </w:rPr>
-              <w:t xml:space="preserve">Validation de A (</w:t>
-            </w:r>
-            <w:r>
-              <w:rPr>
-                <w:rFonts w:ascii="Consolas" w:cs="Consolas" w:eastAsia="Consolas" w:hAnsi="Consolas"/>
-                <w:b/>
-                <w:bCs/>
-                <w:color w:val="8430CE"/>
-                <w:sz w:val="19"/>
-                <w:szCs w:val="19"/>
-              </w:rPr>
-              <w:t xml:space="preserve">validate-jwt</w:t>
-            </w:r>
-            <w:r>
-              <w:rPr>
-                <w:b/>
-                <w:bCs/>
-                <w:sz w:val="19"/>
-                <w:szCs w:val="19"/>
-              </w:rPr>
-              <w:t xml:space="preserve">)</w:t>
+              <w:t xml:space="preserve">Validation de A</w:t>
             </w:r>
           </w:p>
         </w:tc>
@@ -6657,7 +6883,7 @@
         <w:ind w:left="200" w:right="200"/>
       </w:pPr>
       <w:r>
-        <w:t xml:space="preserve">La passerelle ne laisse plus le client choisir la session : tout </w:t>
+        <w:t xml:space="preserve">Le BFF ne laisse plus le client choisir la session : tout </w:t>
       </w:r>
       <w:r>
         <w:rPr>
@@ -6669,7 +6895,7 @@
         <w:t xml:space="preserve">agent_session_id</w:t>
       </w:r>
       <w:r>
-        <w:t xml:space="preserve"> envoyé est rejeté, et APIM impose une session par utilisateur, dérivée de son identité validée (</w:t>
+        <w:t xml:space="preserve"> envoyé est rejeté, et le BFF impose une session par utilisateur, dérivée de son identité validée (</w:t>
       </w:r>
       <w:r>
         <w:rPr>
@@ -6701,7 +6927,19 @@
         <w:t xml:space="preserve">Journalisation</w:t>
       </w:r>
       <w:r>
-        <w:t xml:space="preserve"> : Application Insights reçoit les métriques et les erreurs de la passerelle, </w:t>
+        <w:t xml:space="preserve"> : en mode </w:t>
+      </w:r>
+      <w:r>
+        <w:rPr>
+          <w:rFonts w:ascii="Consolas" w:cs="Consolas" w:eastAsia="Consolas" w:hAnsi="Consolas"/>
+          <w:color w:val="8430CE"/>
+          <w:sz w:val="20"/>
+          <w:szCs w:val="20"/>
+        </w:rPr>
+        <w:t xml:space="preserve">apim</w:t>
+      </w:r>
+      <w:r>
+        <w:t xml:space="preserve">, Application Insights reçoit les métriques et les erreurs de la passerelle, </w:t>
       </w:r>
       <w:r>
         <w:rPr>
@@ -6711,7 +6949,19 @@
         <w:t xml:space="preserve">sans aucun en-tête ni corps</w:t>
       </w:r>
       <w:r>
-        <w:t xml:space="preserve"> : aucun jeton ne peut s'y retrouver.</w:t>
+        <w:t xml:space="preserve"> ; en mode </w:t>
+      </w:r>
+      <w:r>
+        <w:rPr>
+          <w:rFonts w:ascii="Consolas" w:cs="Consolas" w:eastAsia="Consolas" w:hAnsi="Consolas"/>
+          <w:color w:val="8430CE"/>
+          <w:sz w:val="20"/>
+          <w:szCs w:val="20"/>
+        </w:rPr>
+        <w:t xml:space="preserve">code</w:t>
+      </w:r>
+      <w:r>
+        <w:t xml:space="preserve">, le service n'écrit que le type d'erreur, un préfixe de l'identité hachée, le statut et la latence. Aucun jeton ne peut s'y retrouver.</w:t>
       </w:r>
     </w:p>
     <w:p>
@@ -6743,7 +6993,19 @@
         <w:t xml:space="preserve">weather-bff</w:t>
       </w:r>
       <w:r>
-        <w:t xml:space="preserve"> n'est jamais copié dans APIM ; une </w:t>
+        <w:t xml:space="preserve"> reste dans Key Vault. En mode </w:t>
+      </w:r>
+      <w:r>
+        <w:rPr>
+          <w:rFonts w:ascii="Consolas" w:cs="Consolas" w:eastAsia="Consolas" w:hAnsi="Consolas"/>
+          <w:color w:val="8430CE"/>
+          <w:sz w:val="20"/>
+          <w:szCs w:val="20"/>
+        </w:rPr>
+        <w:t xml:space="preserve">apim</w:t>
+      </w:r>
+      <w:r>
+        <w:t xml:space="preserve">, une </w:t>
       </w:r>
       <w:r>
         <w:rPr>
@@ -6753,7 +7015,31 @@
         <w:t xml:space="preserve">named value</w:t>
       </w:r>
       <w:r>
-        <w:t xml:space="preserve"> référence le secret Key Vault, lu par une identité managée distincte de celle qui appelle Foundry.</w:t>
+        <w:t xml:space="preserve"> le référence, lue par une identité managée distincte de celle qui appelle Foundry ; en mode </w:t>
+      </w:r>
+      <w:r>
+        <w:rPr>
+          <w:rFonts w:ascii="Consolas" w:cs="Consolas" w:eastAsia="Consolas" w:hAnsi="Consolas"/>
+          <w:color w:val="8430CE"/>
+          <w:sz w:val="20"/>
+          <w:szCs w:val="20"/>
+        </w:rPr>
+        <w:t xml:space="preserve">code</w:t>
+      </w:r>
+      <w:r>
+        <w:t xml:space="preserve">, la Container App le référence et l'injecte au démarrage (identité </w:t>
+      </w:r>
+      <w:r>
+        <w:rPr>
+          <w:rFonts w:ascii="Consolas" w:cs="Consolas" w:eastAsia="Consolas" w:hAnsi="Consolas"/>
+          <w:color w:val="8430CE"/>
+          <w:sz w:val="20"/>
+          <w:szCs w:val="20"/>
+        </w:rPr>
+        <w:t xml:space="preserve">id-bff</w:t>
+      </w:r>
+      <w:r>
+        <w:t xml:space="preserve">). Il n'apparaît ni dans le code, ni dans l'image, ni dans la configuration du dépôt.</w:t>
       </w:r>
     </w:p>
     <w:p>
@@ -6773,7 +7059,7 @@
         <w:t xml:space="preserve">Testabilité</w:t>
       </w:r>
       <w:r>
-        <w:t xml:space="preserve"> : les policies ne s'exécutent pas localement. Un </w:t>
+        <w:t xml:space="preserve"> : un </w:t>
       </w:r>
       <w:r>
         <w:rPr>
@@ -6783,8 +7069,2906 @@
         <w:t xml:space="preserve">test de bout en bout et de sécurité</w:t>
       </w:r>
       <w:r>
-        <w:t xml:space="preserve"> (31 cas : jetons falsifiés, en-têtes usurpés, corps malveillants, accès croisés, CORS, limitation de débit) est exécuté à chaque déploiement.</w:t>
-      </w:r>
+        <w:t xml:space="preserve"> commun aux deux modes (31 cas : jetons falsifiés, en-têtes usurpés, corps malveillants, accès croisés, CORS, limitation de débit) est exécuté à chaque déploiement. Le service Python dispose en plus de </w:t>
+      </w:r>
+      <w:r>
+        <w:rPr>
+          <w:b/>
+          <w:bCs/>
+        </w:rPr>
+        <w:t xml:space="preserve">35 tests locaux</w:t>
+      </w:r>
+      <w:r>
+        <w:t xml:space="preserve"> sans Azure (faux IdP, faux agent) ; les policies APIM, elles, ne s'exécutent pas localement.</w:t>
+      </w:r>
+    </w:p>
+    <w:p>
+      <w:pPr>
+        <w:pStyle w:val="Heading2"/>
+      </w:pPr>
+      <w:r>
+        <w:t xml:space="preserve">Correspondance entre les deux implémentations</w:t>
+      </w:r>
+    </w:p>
+    <w:tbl>
+      <w:tblPr>
+        <w:tblW w:type="dxa" w:w="9026"/>
+        <w:tblBorders>
+          <w:top w:val="single" w:color="auto" w:sz="4"/>
+          <w:left w:val="single" w:color="auto" w:sz="4"/>
+          <w:bottom w:val="single" w:color="auto" w:sz="4"/>
+          <w:right w:val="single" w:color="auto" w:sz="4"/>
+          <w:insideH w:val="single" w:color="auto" w:sz="4"/>
+          <w:insideV w:val="single" w:color="auto" w:sz="4"/>
+        </w:tblBorders>
+      </w:tblPr>
+      <w:tblGrid>
+        <w:gridCol w:w="2300"/>
+        <w:gridCol w:w="3226"/>
+        <w:gridCol w:w="3500"/>
+      </w:tblGrid>
+      <w:tr>
+        <w:trPr>
+          <w:tblHeader/>
+        </w:trPr>
+        <w:tc>
+          <w:tcPr>
+            <w:tcW w:type="dxa" w:w="2300"/>
+            <w:tcBorders>
+              <w:top w:val="single" w:color="C7CCD6" w:sz="4"/>
+              <w:left w:val="single" w:color="C7CCD6" w:sz="4"/>
+              <w:bottom w:val="single" w:color="C7CCD6" w:sz="4"/>
+              <w:right w:val="single" w:color="C7CCD6" w:sz="4"/>
+            </w:tcBorders>
+            <w:shd w:fill="1F3864" w:color="auto" w:val="clear"/>
+            <w:tcMar>
+              <w:top w:type="dxa" w:w="80"/>
+              <w:left w:type="dxa" w:w="110"/>
+              <w:bottom w:type="dxa" w:w="80"/>
+              <w:right w:type="dxa" w:w="110"/>
+            </w:tcMar>
+          </w:tcPr>
+          <w:p>
+            <w:pPr>
+              <w:spacing w:after="40" w:line="260"/>
+            </w:pPr>
+            <w:r>
+              <w:rPr>
+                <w:b/>
+                <w:bCs/>
+                <w:color w:val="FFFFFF"/>
+                <w:sz w:val="19"/>
+                <w:szCs w:val="19"/>
+              </w:rPr>
+              <w:t xml:space="preserve">Étape</w:t>
+            </w:r>
+          </w:p>
+        </w:tc>
+        <w:tc>
+          <w:tcPr>
+            <w:tcW w:type="dxa" w:w="3226"/>
+            <w:tcBorders>
+              <w:top w:val="single" w:color="C7CCD6" w:sz="4"/>
+              <w:left w:val="single" w:color="C7CCD6" w:sz="4"/>
+              <w:bottom w:val="single" w:color="C7CCD6" w:sz="4"/>
+              <w:right w:val="single" w:color="C7CCD6" w:sz="4"/>
+            </w:tcBorders>
+            <w:shd w:fill="1F3864" w:color="auto" w:val="clear"/>
+            <w:tcMar>
+              <w:top w:type="dxa" w:w="80"/>
+              <w:left w:type="dxa" w:w="110"/>
+              <w:bottom w:type="dxa" w:w="80"/>
+              <w:right w:type="dxa" w:w="110"/>
+            </w:tcMar>
+          </w:tcPr>
+          <w:p>
+            <w:pPr>
+              <w:spacing w:after="40" w:line="260"/>
+            </w:pPr>
+            <w:r>
+              <w:rPr>
+                <w:b/>
+                <w:bCs/>
+                <w:color w:val="FFFFFF"/>
+                <w:sz w:val="19"/>
+                <w:szCs w:val="19"/>
+              </w:rPr>
+              <w:t xml:space="preserve">API Management (policies)</w:t>
+            </w:r>
+          </w:p>
+        </w:tc>
+        <w:tc>
+          <w:tcPr>
+            <w:tcW w:type="dxa" w:w="3500"/>
+            <w:tcBorders>
+              <w:top w:val="single" w:color="C7CCD6" w:sz="4"/>
+              <w:left w:val="single" w:color="C7CCD6" w:sz="4"/>
+              <w:bottom w:val="single" w:color="C7CCD6" w:sz="4"/>
+              <w:right w:val="single" w:color="C7CCD6" w:sz="4"/>
+            </w:tcBorders>
+            <w:shd w:fill="1F3864" w:color="auto" w:val="clear"/>
+            <w:tcMar>
+              <w:top w:type="dxa" w:w="80"/>
+              <w:left w:type="dxa" w:w="110"/>
+              <w:bottom w:type="dxa" w:w="80"/>
+              <w:right w:type="dxa" w:w="110"/>
+            </w:tcMar>
+          </w:tcPr>
+          <w:p>
+            <w:pPr>
+              <w:spacing w:after="40" w:line="260"/>
+            </w:pPr>
+            <w:r>
+              <w:rPr>
+                <w:b/>
+                <w:bCs/>
+                <w:color w:val="FFFFFF"/>
+                <w:sz w:val="19"/>
+                <w:szCs w:val="19"/>
+              </w:rPr>
+              <w:t xml:space="preserve">Service Python (</w:t>
+            </w:r>
+            <w:r>
+              <w:rPr>
+                <w:rFonts w:ascii="Consolas" w:cs="Consolas" w:eastAsia="Consolas" w:hAnsi="Consolas"/>
+                <w:b/>
+                <w:bCs/>
+                <w:color w:val="FFFFFF"/>
+                <w:sz w:val="19"/>
+                <w:szCs w:val="19"/>
+              </w:rPr>
+              <w:t xml:space="preserve">platform/src/bff</w:t>
+            </w:r>
+            <w:r>
+              <w:rPr>
+                <w:b/>
+                <w:bCs/>
+                <w:color w:val="FFFFFF"/>
+                <w:sz w:val="19"/>
+                <w:szCs w:val="19"/>
+              </w:rPr>
+              <w:t xml:space="preserve">)</w:t>
+            </w:r>
+          </w:p>
+        </w:tc>
+      </w:tr>
+      <w:tr>
+        <w:tc>
+          <w:tcPr>
+            <w:tcW w:type="dxa" w:w="2300"/>
+            <w:tcBorders>
+              <w:top w:val="single" w:color="C7CCD6" w:sz="4"/>
+              <w:left w:val="single" w:color="C7CCD6" w:sz="4"/>
+              <w:bottom w:val="single" w:color="C7CCD6" w:sz="4"/>
+              <w:right w:val="single" w:color="C7CCD6" w:sz="4"/>
+            </w:tcBorders>
+            <w:tcMar>
+              <w:top w:type="dxa" w:w="80"/>
+              <w:left w:type="dxa" w:w="110"/>
+              <w:bottom w:type="dxa" w:w="80"/>
+              <w:right w:type="dxa" w:w="110"/>
+            </w:tcMar>
+          </w:tcPr>
+          <w:p>
+            <w:pPr>
+              <w:spacing w:after="40" w:line="260"/>
+            </w:pPr>
+            <w:r>
+              <w:rPr>
+                <w:b/>
+                <w:bCs/>
+                <w:sz w:val="19"/>
+                <w:szCs w:val="19"/>
+              </w:rPr>
+              <w:t xml:space="preserve">CORS et limites de débit</w:t>
+            </w:r>
+          </w:p>
+        </w:tc>
+        <w:tc>
+          <w:tcPr>
+            <w:tcW w:type="dxa" w:w="3226"/>
+            <w:tcBorders>
+              <w:top w:val="single" w:color="C7CCD6" w:sz="4"/>
+              <w:left w:val="single" w:color="C7CCD6" w:sz="4"/>
+              <w:bottom w:val="single" w:color="C7CCD6" w:sz="4"/>
+              <w:right w:val="single" w:color="C7CCD6" w:sz="4"/>
+            </w:tcBorders>
+            <w:tcMar>
+              <w:top w:type="dxa" w:w="80"/>
+              <w:left w:type="dxa" w:w="110"/>
+              <w:bottom w:type="dxa" w:w="80"/>
+              <w:right w:type="dxa" w:w="110"/>
+            </w:tcMar>
+          </w:tcPr>
+          <w:p>
+            <w:pPr>
+              <w:spacing w:after="40" w:line="260"/>
+            </w:pPr>
+            <w:r>
+              <w:rPr>
+                <w:rFonts w:ascii="Consolas" w:cs="Consolas" w:eastAsia="Consolas" w:hAnsi="Consolas"/>
+                <w:b w:val="false"/>
+                <w:bCs w:val="false"/>
+                <w:color w:val="8430CE"/>
+                <w:sz w:val="19"/>
+                <w:szCs w:val="19"/>
+              </w:rPr>
+              <w:t xml:space="preserve">&lt;cors&gt;</w:t>
+            </w:r>
+            <w:r>
+              <w:rPr>
+                <w:b w:val="false"/>
+                <w:bCs w:val="false"/>
+                <w:sz w:val="19"/>
+                <w:szCs w:val="19"/>
+              </w:rPr>
+              <w:t xml:space="preserve">, </w:t>
+            </w:r>
+            <w:r>
+              <w:rPr>
+                <w:rFonts w:ascii="Consolas" w:cs="Consolas" w:eastAsia="Consolas" w:hAnsi="Consolas"/>
+                <w:b w:val="false"/>
+                <w:bCs w:val="false"/>
+                <w:color w:val="8430CE"/>
+                <w:sz w:val="19"/>
+                <w:szCs w:val="19"/>
+              </w:rPr>
+              <w:t xml:space="preserve">rate-limit-by-key</w:t>
+            </w:r>
+          </w:p>
+        </w:tc>
+        <w:tc>
+          <w:tcPr>
+            <w:tcW w:type="dxa" w:w="3500"/>
+            <w:tcBorders>
+              <w:top w:val="single" w:color="C7CCD6" w:sz="4"/>
+              <w:left w:val="single" w:color="C7CCD6" w:sz="4"/>
+              <w:bottom w:val="single" w:color="C7CCD6" w:sz="4"/>
+              <w:right w:val="single" w:color="C7CCD6" w:sz="4"/>
+            </w:tcBorders>
+            <w:tcMar>
+              <w:top w:type="dxa" w:w="80"/>
+              <w:left w:type="dxa" w:w="110"/>
+              <w:bottom w:type="dxa" w:w="80"/>
+              <w:right w:type="dxa" w:w="110"/>
+            </w:tcMar>
+          </w:tcPr>
+          <w:p>
+            <w:pPr>
+              <w:spacing w:after="40" w:line="260"/>
+            </w:pPr>
+            <w:r>
+              <w:rPr>
+                <w:rFonts w:ascii="Consolas" w:cs="Consolas" w:eastAsia="Consolas" w:hAnsi="Consolas"/>
+                <w:b w:val="false"/>
+                <w:bCs w:val="false"/>
+                <w:color w:val="8430CE"/>
+                <w:sz w:val="19"/>
+                <w:szCs w:val="19"/>
+              </w:rPr>
+              <w:t xml:space="preserve">CORSMiddleware</w:t>
+            </w:r>
+            <w:r>
+              <w:rPr>
+                <w:b w:val="false"/>
+                <w:bCs w:val="false"/>
+                <w:sz w:val="19"/>
+                <w:szCs w:val="19"/>
+              </w:rPr>
+              <w:t xml:space="preserve">, </w:t>
+            </w:r>
+            <w:r>
+              <w:rPr>
+                <w:rFonts w:ascii="Consolas" w:cs="Consolas" w:eastAsia="Consolas" w:hAnsi="Consolas"/>
+                <w:b w:val="false"/>
+                <w:bCs w:val="false"/>
+                <w:color w:val="8430CE"/>
+                <w:sz w:val="19"/>
+                <w:szCs w:val="19"/>
+              </w:rPr>
+              <w:t xml:space="preserve">SlidingWindowLimiter</w:t>
+            </w:r>
+          </w:p>
+        </w:tc>
+      </w:tr>
+      <w:tr>
+        <w:tc>
+          <w:tcPr>
+            <w:tcW w:type="dxa" w:w="2300"/>
+            <w:tcBorders>
+              <w:top w:val="single" w:color="C7CCD6" w:sz="4"/>
+              <w:left w:val="single" w:color="C7CCD6" w:sz="4"/>
+              <w:bottom w:val="single" w:color="C7CCD6" w:sz="4"/>
+              <w:right w:val="single" w:color="C7CCD6" w:sz="4"/>
+            </w:tcBorders>
+            <w:shd w:fill="F5F7FA" w:color="auto" w:val="clear"/>
+            <w:tcMar>
+              <w:top w:type="dxa" w:w="80"/>
+              <w:left w:type="dxa" w:w="110"/>
+              <w:bottom w:type="dxa" w:w="80"/>
+              <w:right w:type="dxa" w:w="110"/>
+            </w:tcMar>
+          </w:tcPr>
+          <w:p>
+            <w:pPr>
+              <w:spacing w:after="40" w:line="260"/>
+            </w:pPr>
+            <w:r>
+              <w:rPr>
+                <w:b/>
+                <w:bCs/>
+                <w:sz w:val="19"/>
+                <w:szCs w:val="19"/>
+              </w:rPr>
+              <w:t xml:space="preserve">Refus des en-têtes d'identité</w:t>
+            </w:r>
+          </w:p>
+        </w:tc>
+        <w:tc>
+          <w:tcPr>
+            <w:tcW w:type="dxa" w:w="3226"/>
+            <w:tcBorders>
+              <w:top w:val="single" w:color="C7CCD6" w:sz="4"/>
+              <w:left w:val="single" w:color="C7CCD6" w:sz="4"/>
+              <w:bottom w:val="single" w:color="C7CCD6" w:sz="4"/>
+              <w:right w:val="single" w:color="C7CCD6" w:sz="4"/>
+            </w:tcBorders>
+            <w:shd w:fill="F5F7FA" w:color="auto" w:val="clear"/>
+            <w:tcMar>
+              <w:top w:type="dxa" w:w="80"/>
+              <w:left w:type="dxa" w:w="110"/>
+              <w:bottom w:type="dxa" w:w="80"/>
+              <w:right w:type="dxa" w:w="110"/>
+            </w:tcMar>
+          </w:tcPr>
+          <w:p>
+            <w:pPr>
+              <w:spacing w:after="40" w:line="260"/>
+            </w:pPr>
+            <w:r>
+              <w:rPr>
+                <w:b w:val="false"/>
+                <w:bCs w:val="false"/>
+                <w:sz w:val="19"/>
+                <w:szCs w:val="19"/>
+              </w:rPr>
+              <w:t xml:space="preserve">fragment </w:t>
+            </w:r>
+            <w:r>
+              <w:rPr>
+                <w:rFonts w:ascii="Consolas" w:cs="Consolas" w:eastAsia="Consolas" w:hAnsi="Consolas"/>
+                <w:b w:val="false"/>
+                <w:bCs w:val="false"/>
+                <w:color w:val="8430CE"/>
+                <w:sz w:val="19"/>
+                <w:szCs w:val="19"/>
+              </w:rPr>
+              <w:t xml:space="preserve">reject-sensitive-headers</w:t>
+            </w:r>
+          </w:p>
+        </w:tc>
+        <w:tc>
+          <w:tcPr>
+            <w:tcW w:type="dxa" w:w="3500"/>
+            <w:tcBorders>
+              <w:top w:val="single" w:color="C7CCD6" w:sz="4"/>
+              <w:left w:val="single" w:color="C7CCD6" w:sz="4"/>
+              <w:bottom w:val="single" w:color="C7CCD6" w:sz="4"/>
+              <w:right w:val="single" w:color="C7CCD6" w:sz="4"/>
+            </w:tcBorders>
+            <w:shd w:fill="F5F7FA" w:color="auto" w:val="clear"/>
+            <w:tcMar>
+              <w:top w:type="dxa" w:w="80"/>
+              <w:left w:type="dxa" w:w="110"/>
+              <w:bottom w:type="dxa" w:w="80"/>
+              <w:right w:type="dxa" w:w="110"/>
+            </w:tcMar>
+          </w:tcPr>
+          <w:p>
+            <w:pPr>
+              <w:spacing w:after="40" w:line="260"/>
+            </w:pPr>
+            <w:r>
+              <w:rPr>
+                <w:rFonts w:ascii="Consolas" w:cs="Consolas" w:eastAsia="Consolas" w:hAnsi="Consolas"/>
+                <w:b w:val="false"/>
+                <w:bCs w:val="false"/>
+                <w:color w:val="8430CE"/>
+                <w:sz w:val="19"/>
+                <w:szCs w:val="19"/>
+              </w:rPr>
+              <w:t xml:space="preserve">has_forbidden_header</w:t>
+            </w:r>
+          </w:p>
+        </w:tc>
+      </w:tr>
+      <w:tr>
+        <w:tc>
+          <w:tcPr>
+            <w:tcW w:type="dxa" w:w="2300"/>
+            <w:tcBorders>
+              <w:top w:val="single" w:color="C7CCD6" w:sz="4"/>
+              <w:left w:val="single" w:color="C7CCD6" w:sz="4"/>
+              <w:bottom w:val="single" w:color="C7CCD6" w:sz="4"/>
+              <w:right w:val="single" w:color="C7CCD6" w:sz="4"/>
+            </w:tcBorders>
+            <w:tcMar>
+              <w:top w:type="dxa" w:w="80"/>
+              <w:left w:type="dxa" w:w="110"/>
+              <w:bottom w:type="dxa" w:w="80"/>
+              <w:right w:type="dxa" w:w="110"/>
+            </w:tcMar>
+          </w:tcPr>
+          <w:p>
+            <w:pPr>
+              <w:spacing w:after="40" w:line="260"/>
+            </w:pPr>
+            <w:r>
+              <w:rPr>
+                <w:b/>
+                <w:bCs/>
+                <w:sz w:val="19"/>
+                <w:szCs w:val="19"/>
+              </w:rPr>
+              <w:t xml:space="preserve">Validation de A</w:t>
+            </w:r>
+          </w:p>
+        </w:tc>
+        <w:tc>
+          <w:tcPr>
+            <w:tcW w:type="dxa" w:w="3226"/>
+            <w:tcBorders>
+              <w:top w:val="single" w:color="C7CCD6" w:sz="4"/>
+              <w:left w:val="single" w:color="C7CCD6" w:sz="4"/>
+              <w:bottom w:val="single" w:color="C7CCD6" w:sz="4"/>
+              <w:right w:val="single" w:color="C7CCD6" w:sz="4"/>
+            </w:tcBorders>
+            <w:tcMar>
+              <w:top w:type="dxa" w:w="80"/>
+              <w:left w:type="dxa" w:w="110"/>
+              <w:bottom w:type="dxa" w:w="80"/>
+              <w:right w:type="dxa" w:w="110"/>
+            </w:tcMar>
+          </w:tcPr>
+          <w:p>
+            <w:pPr>
+              <w:spacing w:after="40" w:line="260"/>
+            </w:pPr>
+            <w:r>
+              <w:rPr>
+                <w:rFonts w:ascii="Consolas" w:cs="Consolas" w:eastAsia="Consolas" w:hAnsi="Consolas"/>
+                <w:b w:val="false"/>
+                <w:bCs w:val="false"/>
+                <w:color w:val="8430CE"/>
+                <w:sz w:val="19"/>
+                <w:szCs w:val="19"/>
+              </w:rPr>
+              <w:t xml:space="preserve">validate-jwt</w:t>
+            </w:r>
+          </w:p>
+        </w:tc>
+        <w:tc>
+          <w:tcPr>
+            <w:tcW w:type="dxa" w:w="3500"/>
+            <w:tcBorders>
+              <w:top w:val="single" w:color="C7CCD6" w:sz="4"/>
+              <w:left w:val="single" w:color="C7CCD6" w:sz="4"/>
+              <w:bottom w:val="single" w:color="C7CCD6" w:sz="4"/>
+              <w:right w:val="single" w:color="C7CCD6" w:sz="4"/>
+            </w:tcBorders>
+            <w:tcMar>
+              <w:top w:type="dxa" w:w="80"/>
+              <w:left w:type="dxa" w:w="110"/>
+              <w:bottom w:type="dxa" w:w="80"/>
+              <w:right w:type="dxa" w:w="110"/>
+            </w:tcMar>
+          </w:tcPr>
+          <w:p>
+            <w:pPr>
+              <w:spacing w:after="40" w:line="260"/>
+            </w:pPr>
+            <w:r>
+              <w:rPr>
+                <w:rFonts w:ascii="Consolas" w:cs="Consolas" w:eastAsia="Consolas" w:hAnsi="Consolas"/>
+                <w:b w:val="false"/>
+                <w:bCs w:val="false"/>
+                <w:color w:val="8430CE"/>
+                <w:sz w:val="19"/>
+                <w:szCs w:val="19"/>
+              </w:rPr>
+              <w:t xml:space="preserve">validate_app_token</w:t>
+            </w:r>
+            <w:r>
+              <w:rPr>
+                <w:b w:val="false"/>
+                <w:bCs w:val="false"/>
+                <w:sz w:val="19"/>
+                <w:szCs w:val="19"/>
+              </w:rPr>
+              <w:t xml:space="preserve"> (PyJWT, JWKS en cache)</w:t>
+            </w:r>
+          </w:p>
+        </w:tc>
+      </w:tr>
+      <w:tr>
+        <w:tc>
+          <w:tcPr>
+            <w:tcW w:type="dxa" w:w="2300"/>
+            <w:tcBorders>
+              <w:top w:val="single" w:color="C7CCD6" w:sz="4"/>
+              <w:left w:val="single" w:color="C7CCD6" w:sz="4"/>
+              <w:bottom w:val="single" w:color="C7CCD6" w:sz="4"/>
+              <w:right w:val="single" w:color="C7CCD6" w:sz="4"/>
+            </w:tcBorders>
+            <w:shd w:fill="F5F7FA" w:color="auto" w:val="clear"/>
+            <w:tcMar>
+              <w:top w:type="dxa" w:w="80"/>
+              <w:left w:type="dxa" w:w="110"/>
+              <w:bottom w:type="dxa" w:w="80"/>
+              <w:right w:type="dxa" w:w="110"/>
+            </w:tcMar>
+          </w:tcPr>
+          <w:p>
+            <w:pPr>
+              <w:spacing w:after="40" w:line="260"/>
+            </w:pPr>
+            <w:r>
+              <w:rPr>
+                <w:b/>
+                <w:bCs/>
+                <w:sz w:val="19"/>
+                <w:szCs w:val="19"/>
+              </w:rPr>
+              <w:t xml:space="preserve">Identité déléguée</w:t>
+            </w:r>
+          </w:p>
+        </w:tc>
+        <w:tc>
+          <w:tcPr>
+            <w:tcW w:type="dxa" w:w="3226"/>
+            <w:tcBorders>
+              <w:top w:val="single" w:color="C7CCD6" w:sz="4"/>
+              <w:left w:val="single" w:color="C7CCD6" w:sz="4"/>
+              <w:bottom w:val="single" w:color="C7CCD6" w:sz="4"/>
+              <w:right w:val="single" w:color="C7CCD6" w:sz="4"/>
+            </w:tcBorders>
+            <w:shd w:fill="F5F7FA" w:color="auto" w:val="clear"/>
+            <w:tcMar>
+              <w:top w:type="dxa" w:w="80"/>
+              <w:left w:type="dxa" w:w="110"/>
+              <w:bottom w:type="dxa" w:w="80"/>
+              <w:right w:type="dxa" w:w="110"/>
+            </w:tcMar>
+          </w:tcPr>
+          <w:p>
+            <w:pPr>
+              <w:spacing w:after="40" w:line="260"/>
+            </w:pPr>
+            <w:r>
+              <w:rPr>
+                <w:b w:val="false"/>
+                <w:bCs w:val="false"/>
+                <w:sz w:val="19"/>
+                <w:szCs w:val="19"/>
+              </w:rPr>
+              <w:t xml:space="preserve">variable </w:t>
+            </w:r>
+            <w:r>
+              <w:rPr>
+                <w:rFonts w:ascii="Consolas" w:cs="Consolas" w:eastAsia="Consolas" w:hAnsi="Consolas"/>
+                <w:b w:val="false"/>
+                <w:bCs w:val="false"/>
+                <w:color w:val="8430CE"/>
+                <w:sz w:val="19"/>
+                <w:szCs w:val="19"/>
+              </w:rPr>
+              <w:t xml:space="preserve">delegatedIdentity</w:t>
+            </w:r>
+          </w:p>
+        </w:tc>
+        <w:tc>
+          <w:tcPr>
+            <w:tcW w:type="dxa" w:w="3500"/>
+            <w:tcBorders>
+              <w:top w:val="single" w:color="C7CCD6" w:sz="4"/>
+              <w:left w:val="single" w:color="C7CCD6" w:sz="4"/>
+              <w:bottom w:val="single" w:color="C7CCD6" w:sz="4"/>
+              <w:right w:val="single" w:color="C7CCD6" w:sz="4"/>
+            </w:tcBorders>
+            <w:shd w:fill="F5F7FA" w:color="auto" w:val="clear"/>
+            <w:tcMar>
+              <w:top w:type="dxa" w:w="80"/>
+              <w:left w:type="dxa" w:w="110"/>
+              <w:bottom w:type="dxa" w:w="80"/>
+              <w:right w:type="dxa" w:w="110"/>
+            </w:tcMar>
+          </w:tcPr>
+          <w:p>
+            <w:pPr>
+              <w:spacing w:after="40" w:line="260"/>
+            </w:pPr>
+            <w:r>
+              <w:rPr>
+                <w:rFonts w:ascii="Consolas" w:cs="Consolas" w:eastAsia="Consolas" w:hAnsi="Consolas"/>
+                <w:b w:val="false"/>
+                <w:bCs w:val="false"/>
+                <w:color w:val="8430CE"/>
+                <w:sz w:val="19"/>
+                <w:szCs w:val="19"/>
+              </w:rPr>
+              <w:t xml:space="preserve">delegated_identity</w:t>
+            </w:r>
+          </w:p>
+        </w:tc>
+      </w:tr>
+      <w:tr>
+        <w:tc>
+          <w:tcPr>
+            <w:tcW w:type="dxa" w:w="2300"/>
+            <w:tcBorders>
+              <w:top w:val="single" w:color="C7CCD6" w:sz="4"/>
+              <w:left w:val="single" w:color="C7CCD6" w:sz="4"/>
+              <w:bottom w:val="single" w:color="C7CCD6" w:sz="4"/>
+              <w:right w:val="single" w:color="C7CCD6" w:sz="4"/>
+            </w:tcBorders>
+            <w:tcMar>
+              <w:top w:type="dxa" w:w="80"/>
+              <w:left w:type="dxa" w:w="110"/>
+              <w:bottom w:type="dxa" w:w="80"/>
+              <w:right w:type="dxa" w:w="110"/>
+            </w:tcMar>
+          </w:tcPr>
+          <w:p>
+            <w:pPr>
+              <w:spacing w:after="40" w:line="260"/>
+            </w:pPr>
+            <w:r>
+              <w:rPr>
+                <w:b/>
+                <w:bCs/>
+                <w:sz w:val="19"/>
+                <w:szCs w:val="19"/>
+              </w:rPr>
+              <w:t xml:space="preserve">Corps en liste blanche</w:t>
+            </w:r>
+          </w:p>
+        </w:tc>
+        <w:tc>
+          <w:tcPr>
+            <w:tcW w:type="dxa" w:w="3226"/>
+            <w:tcBorders>
+              <w:top w:val="single" w:color="C7CCD6" w:sz="4"/>
+              <w:left w:val="single" w:color="C7CCD6" w:sz="4"/>
+              <w:bottom w:val="single" w:color="C7CCD6" w:sz="4"/>
+              <w:right w:val="single" w:color="C7CCD6" w:sz="4"/>
+            </w:tcBorders>
+            <w:tcMar>
+              <w:top w:type="dxa" w:w="80"/>
+              <w:left w:type="dxa" w:w="110"/>
+              <w:bottom w:type="dxa" w:w="80"/>
+              <w:right w:type="dxa" w:w="110"/>
+            </w:tcMar>
+          </w:tcPr>
+          <w:p>
+            <w:pPr>
+              <w:spacing w:after="40" w:line="260"/>
+            </w:pPr>
+            <w:r>
+              <w:rPr>
+                <w:b w:val="false"/>
+                <w:bCs w:val="false"/>
+                <w:sz w:val="19"/>
+                <w:szCs w:val="19"/>
+              </w:rPr>
+              <w:t xml:space="preserve">policy de l'opération </w:t>
+            </w:r>
+            <w:r>
+              <w:rPr>
+                <w:rFonts w:ascii="Consolas" w:cs="Consolas" w:eastAsia="Consolas" w:hAnsi="Consolas"/>
+                <w:b w:val="false"/>
+                <w:bCs w:val="false"/>
+                <w:color w:val="8430CE"/>
+                <w:sz w:val="19"/>
+                <w:szCs w:val="19"/>
+              </w:rPr>
+              <w:t xml:space="preserve">responses</w:t>
+            </w:r>
+          </w:p>
+        </w:tc>
+        <w:tc>
+          <w:tcPr>
+            <w:tcW w:type="dxa" w:w="3500"/>
+            <w:tcBorders>
+              <w:top w:val="single" w:color="C7CCD6" w:sz="4"/>
+              <w:left w:val="single" w:color="C7CCD6" w:sz="4"/>
+              <w:bottom w:val="single" w:color="C7CCD6" w:sz="4"/>
+              <w:right w:val="single" w:color="C7CCD6" w:sz="4"/>
+            </w:tcBorders>
+            <w:tcMar>
+              <w:top w:type="dxa" w:w="80"/>
+              <w:left w:type="dxa" w:w="110"/>
+              <w:bottom w:type="dxa" w:w="80"/>
+              <w:right w:type="dxa" w:w="110"/>
+            </w:tcMar>
+          </w:tcPr>
+          <w:p>
+            <w:pPr>
+              <w:spacing w:after="40" w:line="260"/>
+            </w:pPr>
+            <w:r>
+              <w:rPr>
+                <w:rFonts w:ascii="Consolas" w:cs="Consolas" w:eastAsia="Consolas" w:hAnsi="Consolas"/>
+                <w:b w:val="false"/>
+                <w:bCs w:val="false"/>
+                <w:color w:val="8430CE"/>
+                <w:sz w:val="19"/>
+                <w:szCs w:val="19"/>
+              </w:rPr>
+              <w:t xml:space="preserve">parse_chat_body</w:t>
+            </w:r>
+          </w:p>
+        </w:tc>
+      </w:tr>
+      <w:tr>
+        <w:tc>
+          <w:tcPr>
+            <w:tcW w:type="dxa" w:w="2300"/>
+            <w:tcBorders>
+              <w:top w:val="single" w:color="C7CCD6" w:sz="4"/>
+              <w:left w:val="single" w:color="C7CCD6" w:sz="4"/>
+              <w:bottom w:val="single" w:color="C7CCD6" w:sz="4"/>
+              <w:right w:val="single" w:color="C7CCD6" w:sz="4"/>
+            </w:tcBorders>
+            <w:shd w:fill="F5F7FA" w:color="auto" w:val="clear"/>
+            <w:tcMar>
+              <w:top w:type="dxa" w:w="80"/>
+              <w:left w:type="dxa" w:w="110"/>
+              <w:bottom w:type="dxa" w:w="80"/>
+              <w:right w:type="dxa" w:w="110"/>
+            </w:tcMar>
+          </w:tcPr>
+          <w:p>
+            <w:pPr>
+              <w:spacing w:after="40" w:line="260"/>
+            </w:pPr>
+            <w:r>
+              <w:rPr>
+                <w:b/>
+                <w:bCs/>
+                <w:sz w:val="19"/>
+                <w:szCs w:val="19"/>
+              </w:rPr>
+              <w:t xml:space="preserve">Échange OBO + cache</w:t>
+            </w:r>
+          </w:p>
+        </w:tc>
+        <w:tc>
+          <w:tcPr>
+            <w:tcW w:type="dxa" w:w="3226"/>
+            <w:tcBorders>
+              <w:top w:val="single" w:color="C7CCD6" w:sz="4"/>
+              <w:left w:val="single" w:color="C7CCD6" w:sz="4"/>
+              <w:bottom w:val="single" w:color="C7CCD6" w:sz="4"/>
+              <w:right w:val="single" w:color="C7CCD6" w:sz="4"/>
+            </w:tcBorders>
+            <w:shd w:fill="F5F7FA" w:color="auto" w:val="clear"/>
+            <w:tcMar>
+              <w:top w:type="dxa" w:w="80"/>
+              <w:left w:type="dxa" w:w="110"/>
+              <w:bottom w:type="dxa" w:w="80"/>
+              <w:right w:type="dxa" w:w="110"/>
+            </w:tcMar>
+          </w:tcPr>
+          <w:p>
+            <w:pPr>
+              <w:spacing w:after="40" w:line="260"/>
+            </w:pPr>
+            <w:r>
+              <w:rPr>
+                <w:rFonts w:ascii="Consolas" w:cs="Consolas" w:eastAsia="Consolas" w:hAnsi="Consolas"/>
+                <w:b w:val="false"/>
+                <w:bCs w:val="false"/>
+                <w:color w:val="8430CE"/>
+                <w:sz w:val="19"/>
+                <w:szCs w:val="19"/>
+              </w:rPr>
+              <w:t xml:space="preserve">send-request</w:t>
+            </w:r>
+            <w:r>
+              <w:rPr>
+                <w:b w:val="false"/>
+                <w:bCs w:val="false"/>
+                <w:sz w:val="19"/>
+                <w:szCs w:val="19"/>
+              </w:rPr>
+              <w:t xml:space="preserve">, </w:t>
+            </w:r>
+            <w:r>
+              <w:rPr>
+                <w:rFonts w:ascii="Consolas" w:cs="Consolas" w:eastAsia="Consolas" w:hAnsi="Consolas"/>
+                <w:b w:val="false"/>
+                <w:bCs w:val="false"/>
+                <w:color w:val="8430CE"/>
+                <w:sz w:val="19"/>
+                <w:szCs w:val="19"/>
+              </w:rPr>
+              <w:t xml:space="preserve">cache-lookup-value</w:t>
+            </w:r>
+            <w:r>
+              <w:rPr>
+                <w:b w:val="false"/>
+                <w:bCs w:val="false"/>
+                <w:sz w:val="19"/>
+                <w:szCs w:val="19"/>
+              </w:rPr>
+              <w:t xml:space="preserve"> / </w:t>
+            </w:r>
+            <w:r>
+              <w:rPr>
+                <w:rFonts w:ascii="Consolas" w:cs="Consolas" w:eastAsia="Consolas" w:hAnsi="Consolas"/>
+                <w:b w:val="false"/>
+                <w:bCs w:val="false"/>
+                <w:color w:val="8430CE"/>
+                <w:sz w:val="19"/>
+                <w:szCs w:val="19"/>
+              </w:rPr>
+              <w:t xml:space="preserve">cache-store-value</w:t>
+            </w:r>
+          </w:p>
+        </w:tc>
+        <w:tc>
+          <w:tcPr>
+            <w:tcW w:type="dxa" w:w="3500"/>
+            <w:tcBorders>
+              <w:top w:val="single" w:color="C7CCD6" w:sz="4"/>
+              <w:left w:val="single" w:color="C7CCD6" w:sz="4"/>
+              <w:bottom w:val="single" w:color="C7CCD6" w:sz="4"/>
+              <w:right w:val="single" w:color="C7CCD6" w:sz="4"/>
+            </w:tcBorders>
+            <w:shd w:fill="F5F7FA" w:color="auto" w:val="clear"/>
+            <w:tcMar>
+              <w:top w:type="dxa" w:w="80"/>
+              <w:left w:type="dxa" w:w="110"/>
+              <w:bottom w:type="dxa" w:w="80"/>
+              <w:right w:type="dxa" w:w="110"/>
+            </w:tcMar>
+          </w:tcPr>
+          <w:p>
+            <w:pPr>
+              <w:spacing w:after="40" w:line="260"/>
+            </w:pPr>
+            <w:r>
+              <w:rPr>
+                <w:rFonts w:ascii="Consolas" w:cs="Consolas" w:eastAsia="Consolas" w:hAnsi="Consolas"/>
+                <w:b w:val="false"/>
+                <w:bCs w:val="false"/>
+                <w:color w:val="8430CE"/>
+                <w:sz w:val="19"/>
+                <w:szCs w:val="19"/>
+              </w:rPr>
+              <w:t xml:space="preserve">OboExchanger.exchange</w:t>
+            </w:r>
+            <w:r>
+              <w:rPr>
+                <w:b w:val="false"/>
+                <w:bCs w:val="false"/>
+                <w:sz w:val="19"/>
+                <w:szCs w:val="19"/>
+              </w:rPr>
+              <w:t xml:space="preserve"> (httpx, cache en mémoire)</w:t>
+            </w:r>
+          </w:p>
+        </w:tc>
+      </w:tr>
+      <w:tr>
+        <w:tc>
+          <w:tcPr>
+            <w:tcW w:type="dxa" w:w="2300"/>
+            <w:tcBorders>
+              <w:top w:val="single" w:color="C7CCD6" w:sz="4"/>
+              <w:left w:val="single" w:color="C7CCD6" w:sz="4"/>
+              <w:bottom w:val="single" w:color="C7CCD6" w:sz="4"/>
+              <w:right w:val="single" w:color="C7CCD6" w:sz="4"/>
+            </w:tcBorders>
+            <w:tcMar>
+              <w:top w:type="dxa" w:w="80"/>
+              <w:left w:type="dxa" w:w="110"/>
+              <w:bottom w:type="dxa" w:w="80"/>
+              <w:right w:type="dxa" w:w="110"/>
+            </w:tcMar>
+          </w:tcPr>
+          <w:p>
+            <w:pPr>
+              <w:spacing w:after="40" w:line="260"/>
+            </w:pPr>
+            <w:r>
+              <w:rPr>
+                <w:b/>
+                <w:bCs/>
+                <w:sz w:val="19"/>
+                <w:szCs w:val="19"/>
+              </w:rPr>
+              <w:t xml:space="preserve">Validation de B</w:t>
+            </w:r>
+          </w:p>
+        </w:tc>
+        <w:tc>
+          <w:tcPr>
+            <w:tcW w:type="dxa" w:w="3226"/>
+            <w:tcBorders>
+              <w:top w:val="single" w:color="C7CCD6" w:sz="4"/>
+              <w:left w:val="single" w:color="C7CCD6" w:sz="4"/>
+              <w:bottom w:val="single" w:color="C7CCD6" w:sz="4"/>
+              <w:right w:val="single" w:color="C7CCD6" w:sz="4"/>
+            </w:tcBorders>
+            <w:tcMar>
+              <w:top w:type="dxa" w:w="80"/>
+              <w:left w:type="dxa" w:w="110"/>
+              <w:bottom w:type="dxa" w:w="80"/>
+              <w:right w:type="dxa" w:w="110"/>
+            </w:tcMar>
+          </w:tcPr>
+          <w:p>
+            <w:pPr>
+              <w:spacing w:after="40" w:line="260"/>
+            </w:pPr>
+            <w:r>
+              <w:rPr>
+                <w:rFonts w:ascii="Consolas" w:cs="Consolas" w:eastAsia="Consolas" w:hAnsi="Consolas"/>
+                <w:b w:val="false"/>
+                <w:bCs w:val="false"/>
+                <w:color w:val="8430CE"/>
+                <w:sz w:val="19"/>
+                <w:szCs w:val="19"/>
+              </w:rPr>
+              <w:t xml:space="preserve">validate-jwt token-value</w:t>
+            </w:r>
+            <w:r>
+              <w:rPr>
+                <w:b w:val="false"/>
+                <w:bCs w:val="false"/>
+                <w:sz w:val="19"/>
+                <w:szCs w:val="19"/>
+              </w:rPr>
+              <w:t xml:space="preserve"> + contrôle </w:t>
+            </w:r>
+            <w:r>
+              <w:rPr>
+                <w:rFonts w:ascii="Consolas" w:cs="Consolas" w:eastAsia="Consolas" w:hAnsi="Consolas"/>
+                <w:b w:val="false"/>
+                <w:bCs w:val="false"/>
+                <w:color w:val="8430CE"/>
+                <w:sz w:val="19"/>
+                <w:szCs w:val="19"/>
+              </w:rPr>
+              <w:t xml:space="preserve">sub</w:t>
+            </w:r>
+            <w:r>
+              <w:rPr>
+                <w:b w:val="false"/>
+                <w:bCs w:val="false"/>
+                <w:sz w:val="19"/>
+                <w:szCs w:val="19"/>
+              </w:rPr>
+              <w:t xml:space="preserve"> / scope</w:t>
+            </w:r>
+          </w:p>
+        </w:tc>
+        <w:tc>
+          <w:tcPr>
+            <w:tcW w:type="dxa" w:w="3500"/>
+            <w:tcBorders>
+              <w:top w:val="single" w:color="C7CCD6" w:sz="4"/>
+              <w:left w:val="single" w:color="C7CCD6" w:sz="4"/>
+              <w:bottom w:val="single" w:color="C7CCD6" w:sz="4"/>
+              <w:right w:val="single" w:color="C7CCD6" w:sz="4"/>
+            </w:tcBorders>
+            <w:tcMar>
+              <w:top w:type="dxa" w:w="80"/>
+              <w:left w:type="dxa" w:w="110"/>
+              <w:bottom w:type="dxa" w:w="80"/>
+              <w:right w:type="dxa" w:w="110"/>
+            </w:tcMar>
+          </w:tcPr>
+          <w:p>
+            <w:pPr>
+              <w:spacing w:after="40" w:line="260"/>
+            </w:pPr>
+            <w:r>
+              <w:rPr>
+                <w:rFonts w:ascii="Consolas" w:cs="Consolas" w:eastAsia="Consolas" w:hAnsi="Consolas"/>
+                <w:b w:val="false"/>
+                <w:bCs w:val="false"/>
+                <w:color w:val="8430CE"/>
+                <w:sz w:val="19"/>
+                <w:szCs w:val="19"/>
+              </w:rPr>
+              <w:t xml:space="preserve">validate_mcp_token</w:t>
+            </w:r>
+          </w:p>
+        </w:tc>
+      </w:tr>
+      <w:tr>
+        <w:tc>
+          <w:tcPr>
+            <w:tcW w:type="dxa" w:w="2300"/>
+            <w:tcBorders>
+              <w:top w:val="single" w:color="C7CCD6" w:sz="4"/>
+              <w:left w:val="single" w:color="C7CCD6" w:sz="4"/>
+              <w:bottom w:val="single" w:color="C7CCD6" w:sz="4"/>
+              <w:right w:val="single" w:color="C7CCD6" w:sz="4"/>
+            </w:tcBorders>
+            <w:shd w:fill="F5F7FA" w:color="auto" w:val="clear"/>
+            <w:tcMar>
+              <w:top w:type="dxa" w:w="80"/>
+              <w:left w:type="dxa" w:w="110"/>
+              <w:bottom w:type="dxa" w:w="80"/>
+              <w:right w:type="dxa" w:w="110"/>
+            </w:tcMar>
+          </w:tcPr>
+          <w:p>
+            <w:pPr>
+              <w:spacing w:after="40" w:line="260"/>
+            </w:pPr>
+            <w:r>
+              <w:rPr>
+                <w:b/>
+                <w:bCs/>
+                <w:sz w:val="19"/>
+                <w:szCs w:val="19"/>
+              </w:rPr>
+              <w:t xml:space="preserve">Jeton E et appel de l'agent</w:t>
+            </w:r>
+          </w:p>
+        </w:tc>
+        <w:tc>
+          <w:tcPr>
+            <w:tcW w:type="dxa" w:w="3226"/>
+            <w:tcBorders>
+              <w:top w:val="single" w:color="C7CCD6" w:sz="4"/>
+              <w:left w:val="single" w:color="C7CCD6" w:sz="4"/>
+              <w:bottom w:val="single" w:color="C7CCD6" w:sz="4"/>
+              <w:right w:val="single" w:color="C7CCD6" w:sz="4"/>
+            </w:tcBorders>
+            <w:shd w:fill="F5F7FA" w:color="auto" w:val="clear"/>
+            <w:tcMar>
+              <w:top w:type="dxa" w:w="80"/>
+              <w:left w:type="dxa" w:w="110"/>
+              <w:bottom w:type="dxa" w:w="80"/>
+              <w:right w:type="dxa" w:w="110"/>
+            </w:tcMar>
+          </w:tcPr>
+          <w:p>
+            <w:pPr>
+              <w:spacing w:after="40" w:line="260"/>
+            </w:pPr>
+            <w:r>
+              <w:rPr>
+                <w:rFonts w:ascii="Consolas" w:cs="Consolas" w:eastAsia="Consolas" w:hAnsi="Consolas"/>
+                <w:b w:val="false"/>
+                <w:bCs w:val="false"/>
+                <w:color w:val="8430CE"/>
+                <w:sz w:val="19"/>
+                <w:szCs w:val="19"/>
+              </w:rPr>
+              <w:t xml:space="preserve">authentication-managed-identity</w:t>
+            </w:r>
+            <w:r>
+              <w:rPr>
+                <w:b w:val="false"/>
+                <w:bCs w:val="false"/>
+                <w:sz w:val="19"/>
+                <w:szCs w:val="19"/>
+              </w:rPr>
+              <w:t xml:space="preserve">, </w:t>
+            </w:r>
+            <w:r>
+              <w:rPr>
+                <w:rFonts w:ascii="Consolas" w:cs="Consolas" w:eastAsia="Consolas" w:hAnsi="Consolas"/>
+                <w:b w:val="false"/>
+                <w:bCs w:val="false"/>
+                <w:color w:val="8430CE"/>
+                <w:sz w:val="19"/>
+                <w:szCs w:val="19"/>
+              </w:rPr>
+              <w:t xml:space="preserve">forward-request</w:t>
+            </w:r>
+          </w:p>
+        </w:tc>
+        <w:tc>
+          <w:tcPr>
+            <w:tcW w:type="dxa" w:w="3500"/>
+            <w:tcBorders>
+              <w:top w:val="single" w:color="C7CCD6" w:sz="4"/>
+              <w:left w:val="single" w:color="C7CCD6" w:sz="4"/>
+              <w:bottom w:val="single" w:color="C7CCD6" w:sz="4"/>
+              <w:right w:val="single" w:color="C7CCD6" w:sz="4"/>
+            </w:tcBorders>
+            <w:shd w:fill="F5F7FA" w:color="auto" w:val="clear"/>
+            <w:tcMar>
+              <w:top w:type="dxa" w:w="80"/>
+              <w:left w:type="dxa" w:w="110"/>
+              <w:bottom w:type="dxa" w:w="80"/>
+              <w:right w:type="dxa" w:w="110"/>
+            </w:tcMar>
+          </w:tcPr>
+          <w:p>
+            <w:pPr>
+              <w:spacing w:after="40" w:line="260"/>
+            </w:pPr>
+            <w:r>
+              <w:rPr>
+                <w:rFonts w:ascii="Consolas" w:cs="Consolas" w:eastAsia="Consolas" w:hAnsi="Consolas"/>
+                <w:b w:val="false"/>
+                <w:bCs w:val="false"/>
+                <w:color w:val="8430CE"/>
+                <w:sz w:val="19"/>
+                <w:szCs w:val="19"/>
+              </w:rPr>
+              <w:t xml:space="preserve">ManagedIdentityCredential</w:t>
+            </w:r>
+            <w:r>
+              <w:rPr>
+                <w:b w:val="false"/>
+                <w:bCs w:val="false"/>
+                <w:sz w:val="19"/>
+                <w:szCs w:val="19"/>
+              </w:rPr>
+              <w:t xml:space="preserve">, </w:t>
+            </w:r>
+            <w:r>
+              <w:rPr>
+                <w:rFonts w:ascii="Consolas" w:cs="Consolas" w:eastAsia="Consolas" w:hAnsi="Consolas"/>
+                <w:b w:val="false"/>
+                <w:bCs w:val="false"/>
+                <w:color w:val="8430CE"/>
+                <w:sz w:val="19"/>
+                <w:szCs w:val="19"/>
+              </w:rPr>
+              <w:t xml:space="preserve">POST {agent}/responses</w:t>
+            </w:r>
+          </w:p>
+        </w:tc>
+      </w:tr>
+    </w:tbl>
+    <w:p>
+      <w:pPr>
+        <w:pStyle w:val="Heading2"/>
+      </w:pPr>
+      <w:r>
+        <w:t xml:space="preserve">L'échange de jeton en Python</w:t>
+      </w:r>
+    </w:p>
+    <w:p>
+      <w:pPr>
+        <w:spacing w:after="120" w:line="290"/>
+      </w:pPr>
+      <w:r>
+        <w:t xml:space="preserve">En mode </w:t>
+      </w:r>
+      <w:r>
+        <w:rPr>
+          <w:rFonts w:ascii="Consolas" w:cs="Consolas" w:eastAsia="Consolas" w:hAnsi="Consolas"/>
+          <w:color w:val="8430CE"/>
+          <w:sz w:val="20"/>
+          <w:szCs w:val="20"/>
+        </w:rPr>
+        <w:t xml:space="preserve">code</w:t>
+      </w:r>
+      <w:r>
+        <w:t xml:space="preserve">, l'échange On-Behalf-Of est une simple requête HTTP vers le token endpoint de myID :</w:t>
+      </w:r>
+    </w:p>
+    <w:p>
+      <w:pPr>
+        <w:pBdr>
+          <w:left w:val="single" w:color="9AA0A6" w:sz="12" w:space="6"/>
+        </w:pBdr>
+        <w:shd w:fill="F5F7FA" w:color="auto" w:val="clear"/>
+        <w:spacing w:after="0" w:before="120" w:line="250"/>
+        <w:ind w:left="200" w:right="200"/>
+      </w:pPr>
+      <w:r>
+        <w:rPr>
+          <w:rFonts w:ascii="Consolas" w:cs="Consolas" w:eastAsia="Consolas" w:hAnsi="Consolas"/>
+          <w:color w:val="202124"/>
+          <w:sz w:val="17"/>
+          <w:szCs w:val="17"/>
+        </w:rPr>
+        <w:t xml:space="preserve">resp = await http.post(token_endpoint, data={</w:t>
+      </w:r>
+    </w:p>
+    <w:p>
+      <w:pPr>
+        <w:pBdr>
+          <w:left w:val="single" w:color="9AA0A6" w:sz="12" w:space="6"/>
+        </w:pBdr>
+        <w:shd w:fill="F5F7FA" w:color="auto" w:val="clear"/>
+        <w:spacing w:after="0" w:before="0" w:line="250"/>
+        <w:ind w:left="200" w:right="200"/>
+      </w:pPr>
+      <w:r>
+        <w:rPr>
+          <w:rFonts w:ascii="Consolas" w:cs="Consolas" w:eastAsia="Consolas" w:hAnsi="Consolas"/>
+          <w:color w:val="202124"/>
+          <w:sz w:val="17"/>
+          <w:szCs w:val="17"/>
+        </w:rPr>
+        <w:t xml:space="preserve">    "grant_type": "urn:ietf:params:oauth:grant-type:token-exchange",  # RFC 8693</w:t>
+      </w:r>
+    </w:p>
+    <w:p>
+      <w:pPr>
+        <w:pBdr>
+          <w:left w:val="single" w:color="9AA0A6" w:sz="12" w:space="6"/>
+        </w:pBdr>
+        <w:shd w:fill="F5F7FA" w:color="auto" w:val="clear"/>
+        <w:spacing w:after="0" w:before="0" w:line="250"/>
+        <w:ind w:left="200" w:right="200"/>
+      </w:pPr>
+      <w:r>
+        <w:rPr>
+          <w:rFonts w:ascii="Consolas" w:cs="Consolas" w:eastAsia="Consolas" w:hAnsi="Consolas"/>
+          <w:color w:val="202124"/>
+          <w:sz w:val="17"/>
+          <w:szCs w:val="17"/>
+        </w:rPr>
+        <w:t xml:space="preserve">    "subject_token": token_a,                       # jeton de l'application</w:t>
+      </w:r>
+    </w:p>
+    <w:p>
+      <w:pPr>
+        <w:pBdr>
+          <w:left w:val="single" w:color="9AA0A6" w:sz="12" w:space="6"/>
+        </w:pBdr>
+        <w:shd w:fill="F5F7FA" w:color="auto" w:val="clear"/>
+        <w:spacing w:after="0" w:before="0" w:line="250"/>
+        <w:ind w:left="200" w:right="200"/>
+      </w:pPr>
+      <w:r>
+        <w:rPr>
+          <w:rFonts w:ascii="Consolas" w:cs="Consolas" w:eastAsia="Consolas" w:hAnsi="Consolas"/>
+          <w:color w:val="202124"/>
+          <w:sz w:val="17"/>
+          <w:szCs w:val="17"/>
+        </w:rPr>
+        <w:t xml:space="preserve">    "subject_token_type": "urn:ietf:params:oauth:token-type:access_token",</w:t>
+      </w:r>
+    </w:p>
+    <w:p>
+      <w:pPr>
+        <w:pBdr>
+          <w:left w:val="single" w:color="9AA0A6" w:sz="12" w:space="6"/>
+        </w:pBdr>
+        <w:shd w:fill="F5F7FA" w:color="auto" w:val="clear"/>
+        <w:spacing w:after="0" w:before="0" w:line="250"/>
+        <w:ind w:left="200" w:right="200"/>
+      </w:pPr>
+      <w:r>
+        <w:rPr>
+          <w:rFonts w:ascii="Consolas" w:cs="Consolas" w:eastAsia="Consolas" w:hAnsi="Consolas"/>
+          <w:color w:val="202124"/>
+          <w:sz w:val="17"/>
+          <w:szCs w:val="17"/>
+        </w:rPr>
+        <w:t xml:space="preserve">    "requested_token_type": "urn:ietf:params:oauth:token-type:access_token",</w:t>
+      </w:r>
+    </w:p>
+    <w:p>
+      <w:pPr>
+        <w:pBdr>
+          <w:left w:val="single" w:color="9AA0A6" w:sz="12" w:space="6"/>
+        </w:pBdr>
+        <w:shd w:fill="F5F7FA" w:color="auto" w:val="clear"/>
+        <w:spacing w:after="0" w:before="0" w:line="250"/>
+        <w:ind w:left="200" w:right="200"/>
+      </w:pPr>
+      <w:r>
+        <w:rPr>
+          <w:rFonts w:ascii="Consolas" w:cs="Consolas" w:eastAsia="Consolas" w:hAnsi="Consolas"/>
+          <w:color w:val="202124"/>
+          <w:sz w:val="17"/>
+          <w:szCs w:val="17"/>
+        </w:rPr>
+        <w:t xml:space="preserve">    "audience": "weather-mcp",                     # ressource visée</w:t>
+      </w:r>
+    </w:p>
+    <w:p>
+      <w:pPr>
+        <w:pBdr>
+          <w:left w:val="single" w:color="9AA0A6" w:sz="12" w:space="6"/>
+        </w:pBdr>
+        <w:shd w:fill="F5F7FA" w:color="auto" w:val="clear"/>
+        <w:spacing w:after="0" w:before="0" w:line="250"/>
+        <w:ind w:left="200" w:right="200"/>
+      </w:pPr>
+      <w:r>
+        <w:rPr>
+          <w:rFonts w:ascii="Consolas" w:cs="Consolas" w:eastAsia="Consolas" w:hAnsi="Consolas"/>
+          <w:color w:val="202124"/>
+          <w:sz w:val="17"/>
+          <w:szCs w:val="17"/>
+        </w:rPr>
+        <w:t xml:space="preserve">    "scope": "weather:read favorites:write",        # accordés selon les rôles</w:t>
+      </w:r>
+    </w:p>
+    <w:p>
+      <w:pPr>
+        <w:pBdr>
+          <w:left w:val="single" w:color="9AA0A6" w:sz="12" w:space="6"/>
+        </w:pBdr>
+        <w:shd w:fill="F5F7FA" w:color="auto" w:val="clear"/>
+        <w:spacing w:after="0" w:before="0" w:line="250"/>
+        <w:ind w:left="200" w:right="200"/>
+      </w:pPr>
+      <w:r>
+        <w:rPr>
+          <w:rFonts w:ascii="Consolas" w:cs="Consolas" w:eastAsia="Consolas" w:hAnsi="Consolas"/>
+          <w:color w:val="202124"/>
+          <w:sz w:val="17"/>
+          <w:szCs w:val="17"/>
+        </w:rPr>
+        <w:t xml:space="preserve">    "client_id": "weather-bff",                    # client confidentiel</w:t>
+      </w:r>
+    </w:p>
+    <w:p>
+      <w:pPr>
+        <w:pBdr>
+          <w:left w:val="single" w:color="9AA0A6" w:sz="12" w:space="6"/>
+        </w:pBdr>
+        <w:shd w:fill="F5F7FA" w:color="auto" w:val="clear"/>
+        <w:spacing w:after="0" w:before="0" w:line="250"/>
+        <w:ind w:left="200" w:right="200"/>
+      </w:pPr>
+      <w:r>
+        <w:rPr>
+          <w:rFonts w:ascii="Consolas" w:cs="Consolas" w:eastAsia="Consolas" w:hAnsi="Consolas"/>
+          <w:color w:val="202124"/>
+          <w:sz w:val="17"/>
+          <w:szCs w:val="17"/>
+        </w:rPr>
+        <w:t xml:space="preserve">    "client_secret": secret,                         # lu dans Key Vault</w:t>
+      </w:r>
+    </w:p>
+    <w:p>
+      <w:pPr>
+        <w:pBdr>
+          <w:left w:val="single" w:color="9AA0A6" w:sz="12" w:space="6"/>
+        </w:pBdr>
+        <w:shd w:fill="F5F7FA" w:color="auto" w:val="clear"/>
+        <w:spacing w:after="0" w:before="0" w:line="250"/>
+        <w:ind w:left="200" w:right="200"/>
+      </w:pPr>
+      <w:r>
+        <w:rPr>
+          <w:rFonts w:ascii="Consolas" w:cs="Consolas" w:eastAsia="Consolas" w:hAnsi="Consolas"/>
+          <w:color w:val="202124"/>
+          <w:sz w:val="17"/>
+          <w:szCs w:val="17"/>
+        </w:rPr>
+        <w:t xml:space="preserve">})</w:t>
+      </w:r>
+    </w:p>
+    <w:p>
+      <w:pPr>
+        <w:pBdr>
+          <w:left w:val="single" w:color="9AA0A6" w:sz="12" w:space="6"/>
+        </w:pBdr>
+        <w:shd w:fill="F5F7FA" w:color="auto" w:val="clear"/>
+        <w:spacing w:after="160" w:before="0" w:line="250"/>
+        <w:ind w:left="200" w:right="200"/>
+      </w:pPr>
+      <w:r>
+        <w:rPr>
+          <w:rFonts w:ascii="Consolas" w:cs="Consolas" w:eastAsia="Consolas" w:hAnsi="Consolas"/>
+          <w:color w:val="202124"/>
+          <w:sz w:val="17"/>
+          <w:szCs w:val="17"/>
+        </w:rPr>
+        <w:t xml:space="preserve">token_b = resp.json()["access_token"]   # aud=weather-mcp, azp=weather-bff, même sub</w:t>
+      </w:r>
+    </w:p>
+    <w:p>
+      <w:pPr>
+        <w:spacing w:after="120" w:line="290"/>
+      </w:pPr>
+      <w:r>
+        <w:t xml:space="preserve">Le BFF met ensuite B en cache (clé : empreinte SHA-256 de A, jusqu'à 60 secondes avant son expiration), puis </w:t>
+      </w:r>
+      <w:r>
+        <w:rPr>
+          <w:b/>
+          <w:bCs/>
+        </w:rPr>
+        <w:t xml:space="preserve">revalide B à chaque requête</w:t>
+      </w:r>
+      <w:r>
+        <w:t xml:space="preserve"> : signature, </w:t>
+      </w:r>
+      <w:r>
+        <w:rPr>
+          <w:rFonts w:ascii="Consolas" w:cs="Consolas" w:eastAsia="Consolas" w:hAnsi="Consolas"/>
+          <w:color w:val="8430CE"/>
+          <w:sz w:val="20"/>
+          <w:szCs w:val="20"/>
+        </w:rPr>
+        <w:t xml:space="preserve">aud</w:t>
+      </w:r>
+      <w:r>
+        <w:t xml:space="preserve">, </w:t>
+      </w:r>
+      <w:r>
+        <w:rPr>
+          <w:rFonts w:ascii="Consolas" w:cs="Consolas" w:eastAsia="Consolas" w:hAnsi="Consolas"/>
+          <w:color w:val="8430CE"/>
+          <w:sz w:val="20"/>
+          <w:szCs w:val="20"/>
+        </w:rPr>
+        <w:t xml:space="preserve">azp = weather-bff</w:t>
+      </w:r>
+      <w:r>
+        <w:t xml:space="preserve">, même </w:t>
+      </w:r>
+      <w:r>
+        <w:rPr>
+          <w:rFonts w:ascii="Consolas" w:cs="Consolas" w:eastAsia="Consolas" w:hAnsi="Consolas"/>
+          <w:color w:val="8430CE"/>
+          <w:sz w:val="20"/>
+          <w:szCs w:val="20"/>
+        </w:rPr>
+        <w:t xml:space="preserve">sub</w:t>
+      </w:r>
+      <w:r>
+        <w:t xml:space="preserve"> que A, scope </w:t>
+      </w:r>
+      <w:r>
+        <w:rPr>
+          <w:rFonts w:ascii="Consolas" w:cs="Consolas" w:eastAsia="Consolas" w:hAnsi="Consolas"/>
+          <w:color w:val="8430CE"/>
+          <w:sz w:val="20"/>
+          <w:szCs w:val="20"/>
+        </w:rPr>
+        <w:t xml:space="preserve">weather:read</w:t>
+      </w:r>
+      <w:r>
+        <w:t xml:space="preserve">.</w:t>
+      </w:r>
+    </w:p>
+    <w:p>
+      <w:pPr>
+        <w:pStyle w:val="Heading2"/>
+      </w:pPr>
+      <w:r>
+        <w:t xml:space="preserve">Architecture du mode « code »</w:t>
+      </w:r>
+    </w:p>
+    <w:p>
+      <w:pPr>
+        <w:spacing w:after="120" w:line="290"/>
+      </w:pPr>
+      <w:r>
+        <w:t xml:space="preserve">API Management n'est pas déployé. Le BFF est la Container App </w:t>
+      </w:r>
+      <w:r>
+        <w:rPr>
+          <w:rFonts w:ascii="Consolas" w:cs="Consolas" w:eastAsia="Consolas" w:hAnsi="Consolas"/>
+          <w:color w:val="8430CE"/>
+          <w:sz w:val="20"/>
+          <w:szCs w:val="20"/>
+        </w:rPr>
+        <w:t xml:space="preserve">ca-bff</w:t>
+      </w:r>
+      <w:r>
+        <w:t xml:space="preserve"> (FastAPI et uvicorn, ingress HTTPS public, sondes </w:t>
+      </w:r>
+      <w:r>
+        <w:rPr>
+          <w:rFonts w:ascii="Consolas" w:cs="Consolas" w:eastAsia="Consolas" w:hAnsi="Consolas"/>
+          <w:color w:val="8430CE"/>
+          <w:sz w:val="20"/>
+          <w:szCs w:val="20"/>
+        </w:rPr>
+        <w:t xml:space="preserve">/health</w:t>
+      </w:r>
+      <w:r>
+        <w:t xml:space="preserve">), dans le même environnement Container Apps que Keycloak, le serveur MCP et l'application web. Sa seule identité, </w:t>
+      </w:r>
+      <w:r>
+        <w:rPr>
+          <w:rFonts w:ascii="Consolas" w:cs="Consolas" w:eastAsia="Consolas" w:hAnsi="Consolas"/>
+          <w:color w:val="8430CE"/>
+          <w:sz w:val="20"/>
+          <w:szCs w:val="20"/>
+        </w:rPr>
+        <w:t xml:space="preserve">id-bff</w:t>
+      </w:r>
+      <w:r>
+        <w:t xml:space="preserve">, reçoit le strict nécessaire :</w:t>
+      </w:r>
+    </w:p>
+    <w:tbl>
+      <w:tblPr>
+        <w:tblW w:type="dxa" w:w="9026"/>
+        <w:tblBorders>
+          <w:top w:val="single" w:color="auto" w:sz="4"/>
+          <w:left w:val="single" w:color="auto" w:sz="4"/>
+          <w:bottom w:val="single" w:color="auto" w:sz="4"/>
+          <w:right w:val="single" w:color="auto" w:sz="4"/>
+          <w:insideH w:val="single" w:color="auto" w:sz="4"/>
+          <w:insideV w:val="single" w:color="auto" w:sz="4"/>
+        </w:tblBorders>
+      </w:tblPr>
+      <w:tblGrid>
+        <w:gridCol w:w="3600"/>
+        <w:gridCol w:w="2200"/>
+        <w:gridCol w:w="3226"/>
+      </w:tblGrid>
+      <w:tr>
+        <w:trPr>
+          <w:tblHeader/>
+        </w:trPr>
+        <w:tc>
+          <w:tcPr>
+            <w:tcW w:type="dxa" w:w="3600"/>
+            <w:tcBorders>
+              <w:top w:val="single" w:color="C7CCD6" w:sz="4"/>
+              <w:left w:val="single" w:color="C7CCD6" w:sz="4"/>
+              <w:bottom w:val="single" w:color="C7CCD6" w:sz="4"/>
+              <w:right w:val="single" w:color="C7CCD6" w:sz="4"/>
+            </w:tcBorders>
+            <w:shd w:fill="1F3864" w:color="auto" w:val="clear"/>
+            <w:tcMar>
+              <w:top w:type="dxa" w:w="80"/>
+              <w:left w:type="dxa" w:w="110"/>
+              <w:bottom w:type="dxa" w:w="80"/>
+              <w:right w:type="dxa" w:w="110"/>
+            </w:tcMar>
+          </w:tcPr>
+          <w:p>
+            <w:pPr>
+              <w:spacing w:after="40" w:line="260"/>
+            </w:pPr>
+            <w:r>
+              <w:rPr>
+                <w:b/>
+                <w:bCs/>
+                <w:color w:val="FFFFFF"/>
+                <w:sz w:val="19"/>
+                <w:szCs w:val="19"/>
+              </w:rPr>
+              <w:t xml:space="preserve">Rôle de </w:t>
+            </w:r>
+            <w:r>
+              <w:rPr>
+                <w:rFonts w:ascii="Consolas" w:cs="Consolas" w:eastAsia="Consolas" w:hAnsi="Consolas"/>
+                <w:b/>
+                <w:bCs/>
+                <w:color w:val="FFFFFF"/>
+                <w:sz w:val="19"/>
+                <w:szCs w:val="19"/>
+              </w:rPr>
+              <w:t xml:space="preserve">id-bff</w:t>
+            </w:r>
+          </w:p>
+        </w:tc>
+        <w:tc>
+          <w:tcPr>
+            <w:tcW w:type="dxa" w:w="2200"/>
+            <w:tcBorders>
+              <w:top w:val="single" w:color="C7CCD6" w:sz="4"/>
+              <w:left w:val="single" w:color="C7CCD6" w:sz="4"/>
+              <w:bottom w:val="single" w:color="C7CCD6" w:sz="4"/>
+              <w:right w:val="single" w:color="C7CCD6" w:sz="4"/>
+            </w:tcBorders>
+            <w:shd w:fill="1F3864" w:color="auto" w:val="clear"/>
+            <w:tcMar>
+              <w:top w:type="dxa" w:w="80"/>
+              <w:left w:type="dxa" w:w="110"/>
+              <w:bottom w:type="dxa" w:w="80"/>
+              <w:right w:type="dxa" w:w="110"/>
+            </w:tcMar>
+          </w:tcPr>
+          <w:p>
+            <w:pPr>
+              <w:spacing w:after="40" w:line="260"/>
+            </w:pPr>
+            <w:r>
+              <w:rPr>
+                <w:b/>
+                <w:bCs/>
+                <w:color w:val="FFFFFF"/>
+                <w:sz w:val="19"/>
+                <w:szCs w:val="19"/>
+              </w:rPr>
+              <w:t xml:space="preserve">Portée</w:t>
+            </w:r>
+          </w:p>
+        </w:tc>
+        <w:tc>
+          <w:tcPr>
+            <w:tcW w:type="dxa" w:w="3226"/>
+            <w:tcBorders>
+              <w:top w:val="single" w:color="C7CCD6" w:sz="4"/>
+              <w:left w:val="single" w:color="C7CCD6" w:sz="4"/>
+              <w:bottom w:val="single" w:color="C7CCD6" w:sz="4"/>
+              <w:right w:val="single" w:color="C7CCD6" w:sz="4"/>
+            </w:tcBorders>
+            <w:shd w:fill="1F3864" w:color="auto" w:val="clear"/>
+            <w:tcMar>
+              <w:top w:type="dxa" w:w="80"/>
+              <w:left w:type="dxa" w:w="110"/>
+              <w:bottom w:type="dxa" w:w="80"/>
+              <w:right w:type="dxa" w:w="110"/>
+            </w:tcMar>
+          </w:tcPr>
+          <w:p>
+            <w:pPr>
+              <w:spacing w:after="40" w:line="260"/>
+            </w:pPr>
+            <w:r>
+              <w:rPr>
+                <w:b/>
+                <w:bCs/>
+                <w:color w:val="FFFFFF"/>
+                <w:sz w:val="19"/>
+                <w:szCs w:val="19"/>
+              </w:rPr>
+              <w:t xml:space="preserve">Usage</w:t>
+            </w:r>
+          </w:p>
+        </w:tc>
+      </w:tr>
+      <w:tr>
+        <w:tc>
+          <w:tcPr>
+            <w:tcW w:type="dxa" w:w="3600"/>
+            <w:tcBorders>
+              <w:top w:val="single" w:color="C7CCD6" w:sz="4"/>
+              <w:left w:val="single" w:color="C7CCD6" w:sz="4"/>
+              <w:bottom w:val="single" w:color="C7CCD6" w:sz="4"/>
+              <w:right w:val="single" w:color="C7CCD6" w:sz="4"/>
+            </w:tcBorders>
+            <w:tcMar>
+              <w:top w:type="dxa" w:w="80"/>
+              <w:left w:type="dxa" w:w="110"/>
+              <w:bottom w:type="dxa" w:w="80"/>
+              <w:right w:type="dxa" w:w="110"/>
+            </w:tcMar>
+          </w:tcPr>
+          <w:p>
+            <w:pPr>
+              <w:spacing w:after="40" w:line="260"/>
+            </w:pPr>
+            <w:r>
+              <w:rPr>
+                <w:b/>
+                <w:bCs/>
+                <w:sz w:val="19"/>
+                <w:szCs w:val="19"/>
+              </w:rPr>
+              <w:t xml:space="preserve">AcrPull</w:t>
+            </w:r>
+          </w:p>
+        </w:tc>
+        <w:tc>
+          <w:tcPr>
+            <w:tcW w:type="dxa" w:w="2200"/>
+            <w:tcBorders>
+              <w:top w:val="single" w:color="C7CCD6" w:sz="4"/>
+              <w:left w:val="single" w:color="C7CCD6" w:sz="4"/>
+              <w:bottom w:val="single" w:color="C7CCD6" w:sz="4"/>
+              <w:right w:val="single" w:color="C7CCD6" w:sz="4"/>
+            </w:tcBorders>
+            <w:tcMar>
+              <w:top w:type="dxa" w:w="80"/>
+              <w:left w:type="dxa" w:w="110"/>
+              <w:bottom w:type="dxa" w:w="80"/>
+              <w:right w:type="dxa" w:w="110"/>
+            </w:tcMar>
+          </w:tcPr>
+          <w:p>
+            <w:pPr>
+              <w:spacing w:after="40" w:line="260"/>
+            </w:pPr>
+            <w:r>
+              <w:rPr>
+                <w:b w:val="false"/>
+                <w:bCs w:val="false"/>
+                <w:sz w:val="19"/>
+                <w:szCs w:val="19"/>
+              </w:rPr>
+              <w:t xml:space="preserve">Registre de conteneurs</w:t>
+            </w:r>
+          </w:p>
+        </w:tc>
+        <w:tc>
+          <w:tcPr>
+            <w:tcW w:type="dxa" w:w="3226"/>
+            <w:tcBorders>
+              <w:top w:val="single" w:color="C7CCD6" w:sz="4"/>
+              <w:left w:val="single" w:color="C7CCD6" w:sz="4"/>
+              <w:bottom w:val="single" w:color="C7CCD6" w:sz="4"/>
+              <w:right w:val="single" w:color="C7CCD6" w:sz="4"/>
+            </w:tcBorders>
+            <w:tcMar>
+              <w:top w:type="dxa" w:w="80"/>
+              <w:left w:type="dxa" w:w="110"/>
+              <w:bottom w:type="dxa" w:w="80"/>
+              <w:right w:type="dxa" w:w="110"/>
+            </w:tcMar>
+          </w:tcPr>
+          <w:p>
+            <w:pPr>
+              <w:spacing w:after="40" w:line="260"/>
+            </w:pPr>
+            <w:r>
+              <w:rPr>
+                <w:b w:val="false"/>
+                <w:bCs w:val="false"/>
+                <w:sz w:val="19"/>
+                <w:szCs w:val="19"/>
+              </w:rPr>
+              <w:t xml:space="preserve">Tirer l'image </w:t>
+            </w:r>
+            <w:r>
+              <w:rPr>
+                <w:rFonts w:ascii="Consolas" w:cs="Consolas" w:eastAsia="Consolas" w:hAnsi="Consolas"/>
+                <w:b w:val="false"/>
+                <w:bCs w:val="false"/>
+                <w:color w:val="8430CE"/>
+                <w:sz w:val="19"/>
+                <w:szCs w:val="19"/>
+              </w:rPr>
+              <w:t xml:space="preserve">bff</w:t>
+            </w:r>
+          </w:p>
+        </w:tc>
+      </w:tr>
+      <w:tr>
+        <w:tc>
+          <w:tcPr>
+            <w:tcW w:type="dxa" w:w="3600"/>
+            <w:tcBorders>
+              <w:top w:val="single" w:color="C7CCD6" w:sz="4"/>
+              <w:left w:val="single" w:color="C7CCD6" w:sz="4"/>
+              <w:bottom w:val="single" w:color="C7CCD6" w:sz="4"/>
+              <w:right w:val="single" w:color="C7CCD6" w:sz="4"/>
+            </w:tcBorders>
+            <w:shd w:fill="F5F7FA" w:color="auto" w:val="clear"/>
+            <w:tcMar>
+              <w:top w:type="dxa" w:w="80"/>
+              <w:left w:type="dxa" w:w="110"/>
+              <w:bottom w:type="dxa" w:w="80"/>
+              <w:right w:type="dxa" w:w="110"/>
+            </w:tcMar>
+          </w:tcPr>
+          <w:p>
+            <w:pPr>
+              <w:spacing w:after="40" w:line="260"/>
+            </w:pPr>
+            <w:r>
+              <w:rPr>
+                <w:b/>
+                <w:bCs/>
+                <w:sz w:val="19"/>
+                <w:szCs w:val="19"/>
+              </w:rPr>
+              <w:t xml:space="preserve">Key Vault Secrets User</w:t>
+            </w:r>
+          </w:p>
+        </w:tc>
+        <w:tc>
+          <w:tcPr>
+            <w:tcW w:type="dxa" w:w="2200"/>
+            <w:tcBorders>
+              <w:top w:val="single" w:color="C7CCD6" w:sz="4"/>
+              <w:left w:val="single" w:color="C7CCD6" w:sz="4"/>
+              <w:bottom w:val="single" w:color="C7CCD6" w:sz="4"/>
+              <w:right w:val="single" w:color="C7CCD6" w:sz="4"/>
+            </w:tcBorders>
+            <w:shd w:fill="F5F7FA" w:color="auto" w:val="clear"/>
+            <w:tcMar>
+              <w:top w:type="dxa" w:w="80"/>
+              <w:left w:type="dxa" w:w="110"/>
+              <w:bottom w:type="dxa" w:w="80"/>
+              <w:right w:type="dxa" w:w="110"/>
+            </w:tcMar>
+          </w:tcPr>
+          <w:p>
+            <w:pPr>
+              <w:spacing w:after="40" w:line="260"/>
+            </w:pPr>
+            <w:r>
+              <w:rPr>
+                <w:b w:val="false"/>
+                <w:bCs w:val="false"/>
+                <w:sz w:val="19"/>
+                <w:szCs w:val="19"/>
+              </w:rPr>
+              <w:t xml:space="preserve">Key Vault</w:t>
+            </w:r>
+          </w:p>
+        </w:tc>
+        <w:tc>
+          <w:tcPr>
+            <w:tcW w:type="dxa" w:w="3226"/>
+            <w:tcBorders>
+              <w:top w:val="single" w:color="C7CCD6" w:sz="4"/>
+              <w:left w:val="single" w:color="C7CCD6" w:sz="4"/>
+              <w:bottom w:val="single" w:color="C7CCD6" w:sz="4"/>
+              <w:right w:val="single" w:color="C7CCD6" w:sz="4"/>
+            </w:tcBorders>
+            <w:shd w:fill="F5F7FA" w:color="auto" w:val="clear"/>
+            <w:tcMar>
+              <w:top w:type="dxa" w:w="80"/>
+              <w:left w:type="dxa" w:w="110"/>
+              <w:bottom w:type="dxa" w:w="80"/>
+              <w:right w:type="dxa" w:w="110"/>
+            </w:tcMar>
+          </w:tcPr>
+          <w:p>
+            <w:pPr>
+              <w:spacing w:after="40" w:line="260"/>
+            </w:pPr>
+            <w:r>
+              <w:rPr>
+                <w:b w:val="false"/>
+                <w:bCs w:val="false"/>
+                <w:sz w:val="19"/>
+                <w:szCs w:val="19"/>
+              </w:rPr>
+              <w:t xml:space="preserve">Lire </w:t>
+            </w:r>
+            <w:r>
+              <w:rPr>
+                <w:rFonts w:ascii="Consolas" w:cs="Consolas" w:eastAsia="Consolas" w:hAnsi="Consolas"/>
+                <w:b w:val="false"/>
+                <w:bCs w:val="false"/>
+                <w:color w:val="8430CE"/>
+                <w:sz w:val="19"/>
+                <w:szCs w:val="19"/>
+              </w:rPr>
+              <w:t xml:space="preserve">weather-bff-client-secret</w:t>
+            </w:r>
+          </w:p>
+        </w:tc>
+      </w:tr>
+      <w:tr>
+        <w:tc>
+          <w:tcPr>
+            <w:tcW w:type="dxa" w:w="3600"/>
+            <w:tcBorders>
+              <w:top w:val="single" w:color="C7CCD6" w:sz="4"/>
+              <w:left w:val="single" w:color="C7CCD6" w:sz="4"/>
+              <w:bottom w:val="single" w:color="C7CCD6" w:sz="4"/>
+              <w:right w:val="single" w:color="C7CCD6" w:sz="4"/>
+            </w:tcBorders>
+            <w:tcMar>
+              <w:top w:type="dxa" w:w="80"/>
+              <w:left w:type="dxa" w:w="110"/>
+              <w:bottom w:type="dxa" w:w="80"/>
+              <w:right w:type="dxa" w:w="110"/>
+            </w:tcMar>
+          </w:tcPr>
+          <w:p>
+            <w:pPr>
+              <w:spacing w:after="40" w:line="260"/>
+            </w:pPr>
+            <w:r>
+              <w:rPr>
+                <w:b/>
+                <w:bCs/>
+                <w:sz w:val="19"/>
+                <w:szCs w:val="19"/>
+              </w:rPr>
+              <w:t xml:space="preserve">Foundry Agent Consumer</w:t>
+            </w:r>
+          </w:p>
+        </w:tc>
+        <w:tc>
+          <w:tcPr>
+            <w:tcW w:type="dxa" w:w="2200"/>
+            <w:tcBorders>
+              <w:top w:val="single" w:color="C7CCD6" w:sz="4"/>
+              <w:left w:val="single" w:color="C7CCD6" w:sz="4"/>
+              <w:bottom w:val="single" w:color="C7CCD6" w:sz="4"/>
+              <w:right w:val="single" w:color="C7CCD6" w:sz="4"/>
+            </w:tcBorders>
+            <w:tcMar>
+              <w:top w:type="dxa" w:w="80"/>
+              <w:left w:type="dxa" w:w="110"/>
+              <w:bottom w:type="dxa" w:w="80"/>
+              <w:right w:type="dxa" w:w="110"/>
+            </w:tcMar>
+          </w:tcPr>
+          <w:p>
+            <w:pPr>
+              <w:spacing w:after="40" w:line="260"/>
+            </w:pPr>
+            <w:r>
+              <w:rPr>
+                <w:b w:val="false"/>
+                <w:bCs w:val="false"/>
+                <w:sz w:val="19"/>
+                <w:szCs w:val="19"/>
+              </w:rPr>
+              <w:t xml:space="preserve">Projet Foundry</w:t>
+            </w:r>
+          </w:p>
+        </w:tc>
+        <w:tc>
+          <w:tcPr>
+            <w:tcW w:type="dxa" w:w="3226"/>
+            <w:tcBorders>
+              <w:top w:val="single" w:color="C7CCD6" w:sz="4"/>
+              <w:left w:val="single" w:color="C7CCD6" w:sz="4"/>
+              <w:bottom w:val="single" w:color="C7CCD6" w:sz="4"/>
+              <w:right w:val="single" w:color="C7CCD6" w:sz="4"/>
+            </w:tcBorders>
+            <w:tcMar>
+              <w:top w:type="dxa" w:w="80"/>
+              <w:left w:type="dxa" w:w="110"/>
+              <w:bottom w:type="dxa" w:w="80"/>
+              <w:right w:type="dxa" w:w="110"/>
+            </w:tcMar>
+          </w:tcPr>
+          <w:p>
+            <w:pPr>
+              <w:spacing w:after="40" w:line="260"/>
+            </w:pPr>
+            <w:r>
+              <w:rPr>
+                <w:b w:val="false"/>
+                <w:bCs w:val="false"/>
+                <w:sz w:val="19"/>
+                <w:szCs w:val="19"/>
+              </w:rPr>
+              <w:t xml:space="preserve">Appeler l'agent </w:t>
+            </w:r>
+            <w:r>
+              <w:rPr>
+                <w:rFonts w:ascii="Consolas" w:cs="Consolas" w:eastAsia="Consolas" w:hAnsi="Consolas"/>
+                <w:b w:val="false"/>
+                <w:bCs w:val="false"/>
+                <w:color w:val="8430CE"/>
+                <w:sz w:val="19"/>
+                <w:szCs w:val="19"/>
+              </w:rPr>
+              <w:t xml:space="preserve">weather-agent</w:t>
+            </w:r>
+          </w:p>
+        </w:tc>
+      </w:tr>
+      <w:tr>
+        <w:tc>
+          <w:tcPr>
+            <w:tcW w:type="dxa" w:w="3600"/>
+            <w:tcBorders>
+              <w:top w:val="single" w:color="C7CCD6" w:sz="4"/>
+              <w:left w:val="single" w:color="C7CCD6" w:sz="4"/>
+              <w:bottom w:val="single" w:color="C7CCD6" w:sz="4"/>
+              <w:right w:val="single" w:color="C7CCD6" w:sz="4"/>
+            </w:tcBorders>
+            <w:shd w:fill="F5F7FA" w:color="auto" w:val="clear"/>
+            <w:tcMar>
+              <w:top w:type="dxa" w:w="80"/>
+              <w:left w:type="dxa" w:w="110"/>
+              <w:bottom w:type="dxa" w:w="80"/>
+              <w:right w:type="dxa" w:w="110"/>
+            </w:tcMar>
+          </w:tcPr>
+          <w:p>
+            <w:pPr>
+              <w:spacing w:after="40" w:line="260"/>
+            </w:pPr>
+            <w:r>
+              <w:rPr>
+                <w:b/>
+                <w:bCs/>
+                <w:sz w:val="19"/>
+                <w:szCs w:val="19"/>
+              </w:rPr>
+              <w:t xml:space="preserve">Foundry Agent User Identity Impersonation (rôle personnalisé)</w:t>
+            </w:r>
+          </w:p>
+        </w:tc>
+        <w:tc>
+          <w:tcPr>
+            <w:tcW w:type="dxa" w:w="2200"/>
+            <w:tcBorders>
+              <w:top w:val="single" w:color="C7CCD6" w:sz="4"/>
+              <w:left w:val="single" w:color="C7CCD6" w:sz="4"/>
+              <w:bottom w:val="single" w:color="C7CCD6" w:sz="4"/>
+              <w:right w:val="single" w:color="C7CCD6" w:sz="4"/>
+            </w:tcBorders>
+            <w:shd w:fill="F5F7FA" w:color="auto" w:val="clear"/>
+            <w:tcMar>
+              <w:top w:type="dxa" w:w="80"/>
+              <w:left w:type="dxa" w:w="110"/>
+              <w:bottom w:type="dxa" w:w="80"/>
+              <w:right w:type="dxa" w:w="110"/>
+            </w:tcMar>
+          </w:tcPr>
+          <w:p>
+            <w:pPr>
+              <w:spacing w:after="40" w:line="260"/>
+            </w:pPr>
+            <w:r>
+              <w:rPr>
+                <w:b w:val="false"/>
+                <w:bCs w:val="false"/>
+                <w:sz w:val="19"/>
+                <w:szCs w:val="19"/>
+              </w:rPr>
+              <w:t xml:space="preserve">Projet Foundry</w:t>
+            </w:r>
+          </w:p>
+        </w:tc>
+        <w:tc>
+          <w:tcPr>
+            <w:tcW w:type="dxa" w:w="3226"/>
+            <w:tcBorders>
+              <w:top w:val="single" w:color="C7CCD6" w:sz="4"/>
+              <w:left w:val="single" w:color="C7CCD6" w:sz="4"/>
+              <w:bottom w:val="single" w:color="C7CCD6" w:sz="4"/>
+              <w:right w:val="single" w:color="C7CCD6" w:sz="4"/>
+            </w:tcBorders>
+            <w:shd w:fill="F5F7FA" w:color="auto" w:val="clear"/>
+            <w:tcMar>
+              <w:top w:type="dxa" w:w="80"/>
+              <w:left w:type="dxa" w:w="110"/>
+              <w:bottom w:type="dxa" w:w="80"/>
+              <w:right w:type="dxa" w:w="110"/>
+            </w:tcMar>
+          </w:tcPr>
+          <w:p>
+            <w:pPr>
+              <w:spacing w:after="40" w:line="260"/>
+            </w:pPr>
+            <w:r>
+              <w:rPr>
+                <w:b w:val="false"/>
+                <w:bCs w:val="false"/>
+                <w:sz w:val="19"/>
+                <w:szCs w:val="19"/>
+              </w:rPr>
+              <w:t xml:space="preserve">Déclarer l'utilisateur (</w:t>
+            </w:r>
+            <w:r>
+              <w:rPr>
+                <w:rFonts w:ascii="Consolas" w:cs="Consolas" w:eastAsia="Consolas" w:hAnsi="Consolas"/>
+                <w:b w:val="false"/>
+                <w:bCs w:val="false"/>
+                <w:color w:val="8430CE"/>
+                <w:sz w:val="19"/>
+                <w:szCs w:val="19"/>
+              </w:rPr>
+              <w:t xml:space="preserve">x-ms-user-identity</w:t>
+            </w:r>
+            <w:r>
+              <w:rPr>
+                <w:b w:val="false"/>
+                <w:bCs w:val="false"/>
+                <w:sz w:val="19"/>
+                <w:szCs w:val="19"/>
+              </w:rPr>
+              <w:t xml:space="preserve">)</w:t>
+            </w:r>
+          </w:p>
+        </w:tc>
+      </w:tr>
+    </w:tbl>
+    <w:p>
+      <w:pPr>
+        <w:spacing w:after="120" w:line="290"/>
+      </w:pPr>
+    </w:p>
+    <w:p>
+      <w:pPr>
+        <w:spacing w:after="120" w:line="290"/>
+      </w:pPr>
+      <w:r>
+        <w:t xml:space="preserve">Le cache des jetons B et les compteurs de débit sont </w:t>
+      </w:r>
+      <w:r>
+        <w:rPr>
+          <w:b/>
+          <w:bCs/>
+        </w:rPr>
+        <w:t xml:space="preserve">en mémoire</w:t>
+      </w:r>
+      <w:r>
+        <w:t xml:space="preserve"> : le service tourne avec </w:t>
+      </w:r>
+      <w:r>
+        <w:rPr>
+          <w:b/>
+          <w:bCs/>
+        </w:rPr>
+        <w:t xml:space="preserve">un seul réplica</w:t>
+      </w:r>
+      <w:r>
+        <w:t xml:space="preserve"> pour que les limites soient exactes. Pour monter en charge, il faut partager cache et compteurs (par exemple Azure Cache for Redis) avant d'augmenter le nombre de réplicas.</w:t>
+      </w:r>
+    </w:p>
+    <w:p>
+      <w:pPr>
+        <w:pStyle w:val="Heading2"/>
+      </w:pPr>
+      <w:r>
+        <w:t xml:space="preserve">Choisir un mode</w:t>
+      </w:r>
+    </w:p>
+    <w:tbl>
+      <w:tblPr>
+        <w:tblW w:type="dxa" w:w="9026"/>
+        <w:tblBorders>
+          <w:top w:val="single" w:color="auto" w:sz="4"/>
+          <w:left w:val="single" w:color="auto" w:sz="4"/>
+          <w:bottom w:val="single" w:color="auto" w:sz="4"/>
+          <w:right w:val="single" w:color="auto" w:sz="4"/>
+          <w:insideH w:val="single" w:color="auto" w:sz="4"/>
+          <w:insideV w:val="single" w:color="auto" w:sz="4"/>
+        </w:tblBorders>
+      </w:tblPr>
+      <w:tblGrid>
+        <w:gridCol w:w="2300"/>
+        <w:gridCol w:w="3363"/>
+        <w:gridCol w:w="3363"/>
+      </w:tblGrid>
+      <w:tr>
+        <w:trPr>
+          <w:tblHeader/>
+        </w:trPr>
+        <w:tc>
+          <w:tcPr>
+            <w:tcW w:type="dxa" w:w="2300"/>
+            <w:tcBorders>
+              <w:top w:val="single" w:color="C7CCD6" w:sz="4"/>
+              <w:left w:val="single" w:color="C7CCD6" w:sz="4"/>
+              <w:bottom w:val="single" w:color="C7CCD6" w:sz="4"/>
+              <w:right w:val="single" w:color="C7CCD6" w:sz="4"/>
+            </w:tcBorders>
+            <w:shd w:fill="1F3864" w:color="auto" w:val="clear"/>
+            <w:tcMar>
+              <w:top w:type="dxa" w:w="80"/>
+              <w:left w:type="dxa" w:w="110"/>
+              <w:bottom w:type="dxa" w:w="80"/>
+              <w:right w:type="dxa" w:w="110"/>
+            </w:tcMar>
+          </w:tcPr>
+          <w:p>
+            <w:pPr>
+              <w:spacing w:after="40" w:line="260"/>
+            </w:pPr>
+          </w:p>
+        </w:tc>
+        <w:tc>
+          <w:tcPr>
+            <w:tcW w:type="dxa" w:w="3363"/>
+            <w:tcBorders>
+              <w:top w:val="single" w:color="C7CCD6" w:sz="4"/>
+              <w:left w:val="single" w:color="C7CCD6" w:sz="4"/>
+              <w:bottom w:val="single" w:color="C7CCD6" w:sz="4"/>
+              <w:right w:val="single" w:color="C7CCD6" w:sz="4"/>
+            </w:tcBorders>
+            <w:shd w:fill="1F3864" w:color="auto" w:val="clear"/>
+            <w:tcMar>
+              <w:top w:type="dxa" w:w="80"/>
+              <w:left w:type="dxa" w:w="110"/>
+              <w:bottom w:type="dxa" w:w="80"/>
+              <w:right w:type="dxa" w:w="110"/>
+            </w:tcMar>
+          </w:tcPr>
+          <w:p>
+            <w:pPr>
+              <w:spacing w:after="40" w:line="260"/>
+            </w:pPr>
+            <w:r>
+              <w:rPr>
+                <w:rFonts w:ascii="Consolas" w:cs="Consolas" w:eastAsia="Consolas" w:hAnsi="Consolas"/>
+                <w:b/>
+                <w:bCs/>
+                <w:color w:val="FFFFFF"/>
+                <w:sz w:val="19"/>
+                <w:szCs w:val="19"/>
+              </w:rPr>
+              <w:t xml:space="preserve">apim</w:t>
+            </w:r>
+          </w:p>
+        </w:tc>
+        <w:tc>
+          <w:tcPr>
+            <w:tcW w:type="dxa" w:w="3363"/>
+            <w:tcBorders>
+              <w:top w:val="single" w:color="C7CCD6" w:sz="4"/>
+              <w:left w:val="single" w:color="C7CCD6" w:sz="4"/>
+              <w:bottom w:val="single" w:color="C7CCD6" w:sz="4"/>
+              <w:right w:val="single" w:color="C7CCD6" w:sz="4"/>
+            </w:tcBorders>
+            <w:shd w:fill="1F3864" w:color="auto" w:val="clear"/>
+            <w:tcMar>
+              <w:top w:type="dxa" w:w="80"/>
+              <w:left w:type="dxa" w:w="110"/>
+              <w:bottom w:type="dxa" w:w="80"/>
+              <w:right w:type="dxa" w:w="110"/>
+            </w:tcMar>
+          </w:tcPr>
+          <w:p>
+            <w:pPr>
+              <w:spacing w:after="40" w:line="260"/>
+            </w:pPr>
+            <w:r>
+              <w:rPr>
+                <w:rFonts w:ascii="Consolas" w:cs="Consolas" w:eastAsia="Consolas" w:hAnsi="Consolas"/>
+                <w:b/>
+                <w:bCs/>
+                <w:color w:val="FFFFFF"/>
+                <w:sz w:val="19"/>
+                <w:szCs w:val="19"/>
+              </w:rPr>
+              <w:t xml:space="preserve">code</w:t>
+            </w:r>
+          </w:p>
+        </w:tc>
+      </w:tr>
+      <w:tr>
+        <w:tc>
+          <w:tcPr>
+            <w:tcW w:type="dxa" w:w="2300"/>
+            <w:tcBorders>
+              <w:top w:val="single" w:color="C7CCD6" w:sz="4"/>
+              <w:left w:val="single" w:color="C7CCD6" w:sz="4"/>
+              <w:bottom w:val="single" w:color="C7CCD6" w:sz="4"/>
+              <w:right w:val="single" w:color="C7CCD6" w:sz="4"/>
+            </w:tcBorders>
+            <w:tcMar>
+              <w:top w:type="dxa" w:w="80"/>
+              <w:left w:type="dxa" w:w="110"/>
+              <w:bottom w:type="dxa" w:w="80"/>
+              <w:right w:type="dxa" w:w="110"/>
+            </w:tcMar>
+          </w:tcPr>
+          <w:p>
+            <w:pPr>
+              <w:spacing w:after="40" w:line="260"/>
+            </w:pPr>
+            <w:r>
+              <w:rPr>
+                <w:b/>
+                <w:bCs/>
+                <w:sz w:val="19"/>
+                <w:szCs w:val="19"/>
+              </w:rPr>
+              <w:t xml:space="preserve">Code applicatif</w:t>
+            </w:r>
+          </w:p>
+        </w:tc>
+        <w:tc>
+          <w:tcPr>
+            <w:tcW w:type="dxa" w:w="3363"/>
+            <w:tcBorders>
+              <w:top w:val="single" w:color="C7CCD6" w:sz="4"/>
+              <w:left w:val="single" w:color="C7CCD6" w:sz="4"/>
+              <w:bottom w:val="single" w:color="C7CCD6" w:sz="4"/>
+              <w:right w:val="single" w:color="C7CCD6" w:sz="4"/>
+            </w:tcBorders>
+            <w:tcMar>
+              <w:top w:type="dxa" w:w="80"/>
+              <w:left w:type="dxa" w:w="110"/>
+              <w:bottom w:type="dxa" w:w="80"/>
+              <w:right w:type="dxa" w:w="110"/>
+            </w:tcMar>
+          </w:tcPr>
+          <w:p>
+            <w:pPr>
+              <w:spacing w:after="40" w:line="260"/>
+            </w:pPr>
+            <w:r>
+              <w:rPr>
+                <w:b w:val="false"/>
+                <w:bCs w:val="false"/>
+                <w:sz w:val="19"/>
+                <w:szCs w:val="19"/>
+              </w:rPr>
+              <w:t xml:space="preserve">Aucun (policies XML)</w:t>
+            </w:r>
+          </w:p>
+        </w:tc>
+        <w:tc>
+          <w:tcPr>
+            <w:tcW w:type="dxa" w:w="3363"/>
+            <w:tcBorders>
+              <w:top w:val="single" w:color="C7CCD6" w:sz="4"/>
+              <w:left w:val="single" w:color="C7CCD6" w:sz="4"/>
+              <w:bottom w:val="single" w:color="C7CCD6" w:sz="4"/>
+              <w:right w:val="single" w:color="C7CCD6" w:sz="4"/>
+            </w:tcBorders>
+            <w:tcMar>
+              <w:top w:type="dxa" w:w="80"/>
+              <w:left w:type="dxa" w:w="110"/>
+              <w:bottom w:type="dxa" w:w="80"/>
+              <w:right w:type="dxa" w:w="110"/>
+            </w:tcMar>
+          </w:tcPr>
+          <w:p>
+            <w:pPr>
+              <w:spacing w:after="40" w:line="260"/>
+            </w:pPr>
+            <w:r>
+              <w:rPr>
+                <w:b w:val="false"/>
+                <w:bCs w:val="false"/>
+                <w:sz w:val="19"/>
+                <w:szCs w:val="19"/>
+              </w:rPr>
+              <w:t xml:space="preserve">~500 lignes Python</w:t>
+            </w:r>
+          </w:p>
+        </w:tc>
+      </w:tr>
+      <w:tr>
+        <w:tc>
+          <w:tcPr>
+            <w:tcW w:type="dxa" w:w="2300"/>
+            <w:tcBorders>
+              <w:top w:val="single" w:color="C7CCD6" w:sz="4"/>
+              <w:left w:val="single" w:color="C7CCD6" w:sz="4"/>
+              <w:bottom w:val="single" w:color="C7CCD6" w:sz="4"/>
+              <w:right w:val="single" w:color="C7CCD6" w:sz="4"/>
+            </w:tcBorders>
+            <w:shd w:fill="F5F7FA" w:color="auto" w:val="clear"/>
+            <w:tcMar>
+              <w:top w:type="dxa" w:w="80"/>
+              <w:left w:type="dxa" w:w="110"/>
+              <w:bottom w:type="dxa" w:w="80"/>
+              <w:right w:type="dxa" w:w="110"/>
+            </w:tcMar>
+          </w:tcPr>
+          <w:p>
+            <w:pPr>
+              <w:spacing w:after="40" w:line="260"/>
+            </w:pPr>
+            <w:r>
+              <w:rPr>
+                <w:b/>
+                <w:bCs/>
+                <w:sz w:val="19"/>
+                <w:szCs w:val="19"/>
+              </w:rPr>
+              <w:t xml:space="preserve">Identité vers Foundry</w:t>
+            </w:r>
+          </w:p>
+        </w:tc>
+        <w:tc>
+          <w:tcPr>
+            <w:tcW w:type="dxa" w:w="3363"/>
+            <w:tcBorders>
+              <w:top w:val="single" w:color="C7CCD6" w:sz="4"/>
+              <w:left w:val="single" w:color="C7CCD6" w:sz="4"/>
+              <w:bottom w:val="single" w:color="C7CCD6" w:sz="4"/>
+              <w:right w:val="single" w:color="C7CCD6" w:sz="4"/>
+            </w:tcBorders>
+            <w:shd w:fill="F5F7FA" w:color="auto" w:val="clear"/>
+            <w:tcMar>
+              <w:top w:type="dxa" w:w="80"/>
+              <w:left w:type="dxa" w:w="110"/>
+              <w:bottom w:type="dxa" w:w="80"/>
+              <w:right w:type="dxa" w:w="110"/>
+            </w:tcMar>
+          </w:tcPr>
+          <w:p>
+            <w:pPr>
+              <w:spacing w:after="40" w:line="260"/>
+            </w:pPr>
+            <w:r>
+              <w:rPr>
+                <w:rFonts w:ascii="Consolas" w:cs="Consolas" w:eastAsia="Consolas" w:hAnsi="Consolas"/>
+                <w:b w:val="false"/>
+                <w:bCs w:val="false"/>
+                <w:color w:val="8430CE"/>
+                <w:sz w:val="19"/>
+                <w:szCs w:val="19"/>
+              </w:rPr>
+              <w:t xml:space="preserve">id-apim-chat</w:t>
+            </w:r>
+            <w:r>
+              <w:rPr>
+                <w:b w:val="false"/>
+                <w:bCs w:val="false"/>
+                <w:sz w:val="19"/>
+                <w:szCs w:val="19"/>
+              </w:rPr>
+              <w:t xml:space="preserve"> (Key Vault lu par </w:t>
+            </w:r>
+            <w:r>
+              <w:rPr>
+                <w:rFonts w:ascii="Consolas" w:cs="Consolas" w:eastAsia="Consolas" w:hAnsi="Consolas"/>
+                <w:b w:val="false"/>
+                <w:bCs w:val="false"/>
+                <w:color w:val="8430CE"/>
+                <w:sz w:val="19"/>
+                <w:szCs w:val="19"/>
+              </w:rPr>
+              <w:t xml:space="preserve">id-apim-kv</w:t>
+            </w:r>
+            <w:r>
+              <w:rPr>
+                <w:b w:val="false"/>
+                <w:bCs w:val="false"/>
+                <w:sz w:val="19"/>
+                <w:szCs w:val="19"/>
+              </w:rPr>
+              <w:t xml:space="preserve">)</w:t>
+            </w:r>
+          </w:p>
+        </w:tc>
+        <w:tc>
+          <w:tcPr>
+            <w:tcW w:type="dxa" w:w="3363"/>
+            <w:tcBorders>
+              <w:top w:val="single" w:color="C7CCD6" w:sz="4"/>
+              <w:left w:val="single" w:color="C7CCD6" w:sz="4"/>
+              <w:bottom w:val="single" w:color="C7CCD6" w:sz="4"/>
+              <w:right w:val="single" w:color="C7CCD6" w:sz="4"/>
+            </w:tcBorders>
+            <w:shd w:fill="F5F7FA" w:color="auto" w:val="clear"/>
+            <w:tcMar>
+              <w:top w:type="dxa" w:w="80"/>
+              <w:left w:type="dxa" w:w="110"/>
+              <w:bottom w:type="dxa" w:w="80"/>
+              <w:right w:type="dxa" w:w="110"/>
+            </w:tcMar>
+          </w:tcPr>
+          <w:p>
+            <w:pPr>
+              <w:spacing w:after="40" w:line="260"/>
+            </w:pPr>
+            <w:r>
+              <w:rPr>
+                <w:rFonts w:ascii="Consolas" w:cs="Consolas" w:eastAsia="Consolas" w:hAnsi="Consolas"/>
+                <w:b w:val="false"/>
+                <w:bCs w:val="false"/>
+                <w:color w:val="8430CE"/>
+                <w:sz w:val="19"/>
+                <w:szCs w:val="19"/>
+              </w:rPr>
+              <w:t xml:space="preserve">id-bff</w:t>
+            </w:r>
+            <w:r>
+              <w:rPr>
+                <w:b w:val="false"/>
+                <w:bCs w:val="false"/>
+                <w:sz w:val="19"/>
+                <w:szCs w:val="19"/>
+              </w:rPr>
+              <w:t xml:space="preserve"> (lit aussi Key Vault)</w:t>
+            </w:r>
+          </w:p>
+        </w:tc>
+      </w:tr>
+      <w:tr>
+        <w:tc>
+          <w:tcPr>
+            <w:tcW w:type="dxa" w:w="2300"/>
+            <w:tcBorders>
+              <w:top w:val="single" w:color="C7CCD6" w:sz="4"/>
+              <w:left w:val="single" w:color="C7CCD6" w:sz="4"/>
+              <w:bottom w:val="single" w:color="C7CCD6" w:sz="4"/>
+              <w:right w:val="single" w:color="C7CCD6" w:sz="4"/>
+            </w:tcBorders>
+            <w:tcMar>
+              <w:top w:type="dxa" w:w="80"/>
+              <w:left w:type="dxa" w:w="110"/>
+              <w:bottom w:type="dxa" w:w="80"/>
+              <w:right w:type="dxa" w:w="110"/>
+            </w:tcMar>
+          </w:tcPr>
+          <w:p>
+            <w:pPr>
+              <w:spacing w:after="40" w:line="260"/>
+            </w:pPr>
+            <w:r>
+              <w:rPr>
+                <w:b/>
+                <w:bCs/>
+                <w:sz w:val="19"/>
+                <w:szCs w:val="19"/>
+              </w:rPr>
+              <w:t xml:space="preserve">Limitation de débit</w:t>
+            </w:r>
+          </w:p>
+        </w:tc>
+        <w:tc>
+          <w:tcPr>
+            <w:tcW w:type="dxa" w:w="3363"/>
+            <w:tcBorders>
+              <w:top w:val="single" w:color="C7CCD6" w:sz="4"/>
+              <w:left w:val="single" w:color="C7CCD6" w:sz="4"/>
+              <w:bottom w:val="single" w:color="C7CCD6" w:sz="4"/>
+              <w:right w:val="single" w:color="C7CCD6" w:sz="4"/>
+            </w:tcBorders>
+            <w:tcMar>
+              <w:top w:type="dxa" w:w="80"/>
+              <w:left w:type="dxa" w:w="110"/>
+              <w:bottom w:type="dxa" w:w="80"/>
+              <w:right w:type="dxa" w:w="110"/>
+            </w:tcMar>
+          </w:tcPr>
+          <w:p>
+            <w:pPr>
+              <w:spacing w:after="40" w:line="260"/>
+            </w:pPr>
+            <w:r>
+              <w:rPr>
+                <w:b w:val="false"/>
+                <w:bCs w:val="false"/>
+                <w:sz w:val="19"/>
+                <w:szCs w:val="19"/>
+              </w:rPr>
+              <w:t xml:space="preserve">Approximative (compteurs APIM v2 asynchrones)</w:t>
+            </w:r>
+          </w:p>
+        </w:tc>
+        <w:tc>
+          <w:tcPr>
+            <w:tcW w:type="dxa" w:w="3363"/>
+            <w:tcBorders>
+              <w:top w:val="single" w:color="C7CCD6" w:sz="4"/>
+              <w:left w:val="single" w:color="C7CCD6" w:sz="4"/>
+              <w:bottom w:val="single" w:color="C7CCD6" w:sz="4"/>
+              <w:right w:val="single" w:color="C7CCD6" w:sz="4"/>
+            </w:tcBorders>
+            <w:tcMar>
+              <w:top w:type="dxa" w:w="80"/>
+              <w:left w:type="dxa" w:w="110"/>
+              <w:bottom w:type="dxa" w:w="80"/>
+              <w:right w:type="dxa" w:w="110"/>
+            </w:tcMar>
+          </w:tcPr>
+          <w:p>
+            <w:pPr>
+              <w:spacing w:after="40" w:line="260"/>
+            </w:pPr>
+            <w:r>
+              <w:rPr>
+                <w:b w:val="false"/>
+                <w:bCs w:val="false"/>
+                <w:sz w:val="19"/>
+                <w:szCs w:val="19"/>
+              </w:rPr>
+              <w:t xml:space="preserve">Exacte (un réplica ; Redis pour passer à l'échelle)</w:t>
+            </w:r>
+          </w:p>
+        </w:tc>
+      </w:tr>
+      <w:tr>
+        <w:tc>
+          <w:tcPr>
+            <w:tcW w:type="dxa" w:w="2300"/>
+            <w:tcBorders>
+              <w:top w:val="single" w:color="C7CCD6" w:sz="4"/>
+              <w:left w:val="single" w:color="C7CCD6" w:sz="4"/>
+              <w:bottom w:val="single" w:color="C7CCD6" w:sz="4"/>
+              <w:right w:val="single" w:color="C7CCD6" w:sz="4"/>
+            </w:tcBorders>
+            <w:shd w:fill="F5F7FA" w:color="auto" w:val="clear"/>
+            <w:tcMar>
+              <w:top w:type="dxa" w:w="80"/>
+              <w:left w:type="dxa" w:w="110"/>
+              <w:bottom w:type="dxa" w:w="80"/>
+              <w:right w:type="dxa" w:w="110"/>
+            </w:tcMar>
+          </w:tcPr>
+          <w:p>
+            <w:pPr>
+              <w:spacing w:after="40" w:line="260"/>
+            </w:pPr>
+            <w:r>
+              <w:rPr>
+                <w:b/>
+                <w:bCs/>
+                <w:sz w:val="19"/>
+                <w:szCs w:val="19"/>
+              </w:rPr>
+              <w:t xml:space="preserve">Tests</w:t>
+            </w:r>
+          </w:p>
+        </w:tc>
+        <w:tc>
+          <w:tcPr>
+            <w:tcW w:type="dxa" w:w="3363"/>
+            <w:tcBorders>
+              <w:top w:val="single" w:color="C7CCD6" w:sz="4"/>
+              <w:left w:val="single" w:color="C7CCD6" w:sz="4"/>
+              <w:bottom w:val="single" w:color="C7CCD6" w:sz="4"/>
+              <w:right w:val="single" w:color="C7CCD6" w:sz="4"/>
+            </w:tcBorders>
+            <w:shd w:fill="F5F7FA" w:color="auto" w:val="clear"/>
+            <w:tcMar>
+              <w:top w:type="dxa" w:w="80"/>
+              <w:left w:type="dxa" w:w="110"/>
+              <w:bottom w:type="dxa" w:w="80"/>
+              <w:right w:type="dxa" w:w="110"/>
+            </w:tcMar>
+          </w:tcPr>
+          <w:p>
+            <w:pPr>
+              <w:spacing w:after="40" w:line="260"/>
+            </w:pPr>
+            <w:r>
+              <w:rPr>
+                <w:b w:val="false"/>
+                <w:bCs w:val="false"/>
+                <w:sz w:val="19"/>
+                <w:szCs w:val="19"/>
+              </w:rPr>
+              <w:t xml:space="preserve">Bout en bout</w:t>
+            </w:r>
+          </w:p>
+        </w:tc>
+        <w:tc>
+          <w:tcPr>
+            <w:tcW w:type="dxa" w:w="3363"/>
+            <w:tcBorders>
+              <w:top w:val="single" w:color="C7CCD6" w:sz="4"/>
+              <w:left w:val="single" w:color="C7CCD6" w:sz="4"/>
+              <w:bottom w:val="single" w:color="C7CCD6" w:sz="4"/>
+              <w:right w:val="single" w:color="C7CCD6" w:sz="4"/>
+            </w:tcBorders>
+            <w:shd w:fill="F5F7FA" w:color="auto" w:val="clear"/>
+            <w:tcMar>
+              <w:top w:type="dxa" w:w="80"/>
+              <w:left w:type="dxa" w:w="110"/>
+              <w:bottom w:type="dxa" w:w="80"/>
+              <w:right w:type="dxa" w:w="110"/>
+            </w:tcMar>
+          </w:tcPr>
+          <w:p>
+            <w:pPr>
+              <w:spacing w:after="40" w:line="260"/>
+            </w:pPr>
+            <w:r>
+              <w:rPr>
+                <w:b w:val="false"/>
+                <w:bCs w:val="false"/>
+                <w:sz w:val="19"/>
+                <w:szCs w:val="19"/>
+              </w:rPr>
+              <w:t xml:space="preserve">Tests locaux sans Azure + bout en bout</w:t>
+            </w:r>
+          </w:p>
+        </w:tc>
+      </w:tr>
+      <w:tr>
+        <w:tc>
+          <w:tcPr>
+            <w:tcW w:type="dxa" w:w="2300"/>
+            <w:tcBorders>
+              <w:top w:val="single" w:color="C7CCD6" w:sz="4"/>
+              <w:left w:val="single" w:color="C7CCD6" w:sz="4"/>
+              <w:bottom w:val="single" w:color="C7CCD6" w:sz="4"/>
+              <w:right w:val="single" w:color="C7CCD6" w:sz="4"/>
+            </w:tcBorders>
+            <w:tcMar>
+              <w:top w:type="dxa" w:w="80"/>
+              <w:left w:type="dxa" w:w="110"/>
+              <w:bottom w:type="dxa" w:w="80"/>
+              <w:right w:type="dxa" w:w="110"/>
+            </w:tcMar>
+          </w:tcPr>
+          <w:p>
+            <w:pPr>
+              <w:spacing w:after="40" w:line="260"/>
+            </w:pPr>
+            <w:r>
+              <w:rPr>
+                <w:b/>
+                <w:bCs/>
+                <w:sz w:val="19"/>
+                <w:szCs w:val="19"/>
+              </w:rPr>
+              <w:t xml:space="preserve">Coût et délai de déploiement</w:t>
+            </w:r>
+          </w:p>
+        </w:tc>
+        <w:tc>
+          <w:tcPr>
+            <w:tcW w:type="dxa" w:w="3363"/>
+            <w:tcBorders>
+              <w:top w:val="single" w:color="C7CCD6" w:sz="4"/>
+              <w:left w:val="single" w:color="C7CCD6" w:sz="4"/>
+              <w:bottom w:val="single" w:color="C7CCD6" w:sz="4"/>
+              <w:right w:val="single" w:color="C7CCD6" w:sz="4"/>
+            </w:tcBorders>
+            <w:tcMar>
+              <w:top w:type="dxa" w:w="80"/>
+              <w:left w:type="dxa" w:w="110"/>
+              <w:bottom w:type="dxa" w:w="80"/>
+              <w:right w:type="dxa" w:w="110"/>
+            </w:tcMar>
+          </w:tcPr>
+          <w:p>
+            <w:pPr>
+              <w:spacing w:after="40" w:line="260"/>
+            </w:pPr>
+            <w:r>
+              <w:rPr>
+                <w:b w:val="false"/>
+                <w:bCs w:val="false"/>
+                <w:sz w:val="19"/>
+                <w:szCs w:val="19"/>
+              </w:rPr>
+              <w:t xml:space="preserve">Plus élevés (service API Management)</w:t>
+            </w:r>
+          </w:p>
+        </w:tc>
+        <w:tc>
+          <w:tcPr>
+            <w:tcW w:type="dxa" w:w="3363"/>
+            <w:tcBorders>
+              <w:top w:val="single" w:color="C7CCD6" w:sz="4"/>
+              <w:left w:val="single" w:color="C7CCD6" w:sz="4"/>
+              <w:bottom w:val="single" w:color="C7CCD6" w:sz="4"/>
+              <w:right w:val="single" w:color="C7CCD6" w:sz="4"/>
+            </w:tcBorders>
+            <w:tcMar>
+              <w:top w:type="dxa" w:w="80"/>
+              <w:left w:type="dxa" w:w="110"/>
+              <w:bottom w:type="dxa" w:w="80"/>
+              <w:right w:type="dxa" w:w="110"/>
+            </w:tcMar>
+          </w:tcPr>
+          <w:p>
+            <w:pPr>
+              <w:spacing w:after="40" w:line="260"/>
+            </w:pPr>
+            <w:r>
+              <w:rPr>
+                <w:b w:val="false"/>
+                <w:bCs w:val="false"/>
+                <w:sz w:val="19"/>
+                <w:szCs w:val="19"/>
+              </w:rPr>
+              <w:t xml:space="preserve">Plus faibles (une Container App)</w:t>
+            </w:r>
+          </w:p>
+        </w:tc>
+      </w:tr>
+      <w:tr>
+        <w:tc>
+          <w:tcPr>
+            <w:tcW w:type="dxa" w:w="2300"/>
+            <w:tcBorders>
+              <w:top w:val="single" w:color="C7CCD6" w:sz="4"/>
+              <w:left w:val="single" w:color="C7CCD6" w:sz="4"/>
+              <w:bottom w:val="single" w:color="C7CCD6" w:sz="4"/>
+              <w:right w:val="single" w:color="C7CCD6" w:sz="4"/>
+            </w:tcBorders>
+            <w:shd w:fill="F5F7FA" w:color="auto" w:val="clear"/>
+            <w:tcMar>
+              <w:top w:type="dxa" w:w="80"/>
+              <w:left w:type="dxa" w:w="110"/>
+              <w:bottom w:type="dxa" w:w="80"/>
+              <w:right w:type="dxa" w:w="110"/>
+            </w:tcMar>
+          </w:tcPr>
+          <w:p>
+            <w:pPr>
+              <w:spacing w:after="40" w:line="260"/>
+            </w:pPr>
+            <w:r>
+              <w:rPr>
+                <w:b/>
+                <w:bCs/>
+                <w:sz w:val="19"/>
+                <w:szCs w:val="19"/>
+              </w:rPr>
+              <w:t xml:space="preserve">Extensions naturelles</w:t>
+            </w:r>
+          </w:p>
+        </w:tc>
+        <w:tc>
+          <w:tcPr>
+            <w:tcW w:type="dxa" w:w="3363"/>
+            <w:tcBorders>
+              <w:top w:val="single" w:color="C7CCD6" w:sz="4"/>
+              <w:left w:val="single" w:color="C7CCD6" w:sz="4"/>
+              <w:bottom w:val="single" w:color="C7CCD6" w:sz="4"/>
+              <w:right w:val="single" w:color="C7CCD6" w:sz="4"/>
+            </w:tcBorders>
+            <w:shd w:fill="F5F7FA" w:color="auto" w:val="clear"/>
+            <w:tcMar>
+              <w:top w:type="dxa" w:w="80"/>
+              <w:left w:type="dxa" w:w="110"/>
+              <w:bottom w:type="dxa" w:w="80"/>
+              <w:right w:type="dxa" w:w="110"/>
+            </w:tcMar>
+          </w:tcPr>
+          <w:p>
+            <w:pPr>
+              <w:spacing w:after="40" w:line="260"/>
+            </w:pPr>
+            <w:r>
+              <w:rPr>
+                <w:b w:val="false"/>
+                <w:bCs w:val="false"/>
+                <w:sz w:val="19"/>
+                <w:szCs w:val="19"/>
+              </w:rPr>
+              <w:t xml:space="preserve">Gouvernance, quotas, AI Gateway, catalogue d'API</w:t>
+            </w:r>
+          </w:p>
+        </w:tc>
+        <w:tc>
+          <w:tcPr>
+            <w:tcW w:type="dxa" w:w="3363"/>
+            <w:tcBorders>
+              <w:top w:val="single" w:color="C7CCD6" w:sz="4"/>
+              <w:left w:val="single" w:color="C7CCD6" w:sz="4"/>
+              <w:bottom w:val="single" w:color="C7CCD6" w:sz="4"/>
+              <w:right w:val="single" w:color="C7CCD6" w:sz="4"/>
+            </w:tcBorders>
+            <w:shd w:fill="F5F7FA" w:color="auto" w:val="clear"/>
+            <w:tcMar>
+              <w:top w:type="dxa" w:w="80"/>
+              <w:left w:type="dxa" w:w="110"/>
+              <w:bottom w:type="dxa" w:w="80"/>
+              <w:right w:type="dxa" w:w="110"/>
+            </w:tcMar>
+          </w:tcPr>
+          <w:p>
+            <w:pPr>
+              <w:spacing w:after="40" w:line="260"/>
+            </w:pPr>
+            <w:r>
+              <w:rPr>
+                <w:b w:val="false"/>
+                <w:bCs w:val="false"/>
+                <w:sz w:val="19"/>
+                <w:szCs w:val="19"/>
+              </w:rPr>
+              <w:t xml:space="preserve">Logique métier, DPoP, tests unitaires</w:t>
+            </w:r>
+          </w:p>
+        </w:tc>
+      </w:tr>
+    </w:tbl>
+    <w:p>
+      <w:pPr>
+        <w:pBdr>
+          <w:left w:val="single" w:color="E8710A" w:sz="24" w:space="8"/>
+        </w:pBdr>
+        <w:shd w:fill="FFF4E5" w:color="auto" w:val="clear"/>
+        <w:spacing w:after="0" w:before="160"/>
+        <w:ind w:left="200" w:right="200"/>
+      </w:pPr>
+      <w:r>
+        <w:rPr>
+          <w:b/>
+          <w:bCs/>
+          <w:color w:val="E8710A"/>
+        </w:rPr>
+        <w:t xml:space="preserve">Un environnement, un mode</w:t>
+      </w:r>
+    </w:p>
+    <w:p>
+      <w:pPr>
+        <w:pBdr>
+          <w:left w:val="single" w:color="E8710A" w:sz="24" w:space="8"/>
+        </w:pBdr>
+        <w:shd w:fill="FFF4E5" w:color="auto" w:val="clear"/>
+        <w:spacing w:after="200" w:before="0" w:line="290"/>
+        <w:ind w:left="200" w:right="200"/>
+      </w:pPr>
+      <w:r>
+        <w:t xml:space="preserve">Le script de déploiement refuse de changer le mode d'un environnement existant : sinon, l'identité de l'ancien mode conserverait son droit d'impersonation. Pour comparer les deux, on déploie deux environnements (deux resource groups).</w:t>
+      </w:r>
+    </w:p>
+    <w:p>
+      <w:pPr>
+        <w:spacing w:after="120" w:line="290"/>
+      </w:pPr>
     </w:p>
     <w:p>
       <w:pPr>
@@ -7602,7 +10786,7 @@
                 <w:sz w:val="19"/>
                 <w:szCs w:val="19"/>
               </w:rPr>
-              <w:t xml:space="preserve">Secret uniquement dans Key Vault, lu par APIM via une identité managée dédiée ; en production </w:t>
+              <w:t xml:space="preserve">Secret uniquement dans Key Vault, lu par le seul BFF via son identité managée ; en production </w:t>
             </w:r>
             <w:r>
               <w:rPr>
@@ -7699,7 +10883,7 @@
                 <w:sz w:val="19"/>
                 <w:szCs w:val="19"/>
               </w:rPr>
-              <w:t xml:space="preserve">En-tête calculé uniquement par APIM ; un client qui l'envoie est rejeté (400) ; permission d'impersonation réservée à l'identité dédiée de l'API « chat »</w:t>
+              <w:t xml:space="preserve">En-tête calculé uniquement par le BFF ; un client qui l'envoie est rejeté (400) ; permission d'impersonation réservée à l'identité dédiée du BFF (une seule implémentation par environnement)</w:t>
             </w:r>
           </w:p>
         </w:tc>
@@ -7783,7 +10967,7 @@
                 <w:sz w:val="19"/>
                 <w:szCs w:val="19"/>
               </w:rPr>
-              <w:t xml:space="preserve">Session imposée par la passerelle et dérivée de l'identité ; toute valeur envoyée par le client est rejetée</w:t>
+              <w:t xml:space="preserve">Session imposée par le BFF et dérivée de l'identité ; toute valeur envoyée par le client est rejetée</w:t>
             </w:r>
           </w:p>
         </w:tc>
@@ -7909,7 +11093,7 @@
                 <w:sz w:val="19"/>
                 <w:szCs w:val="19"/>
               </w:rPr>
-              <w:t xml:space="preserve">Corps reconstruit par la passerelle à partir d'une liste blanche</w:t>
+              <w:t xml:space="preserve">Corps reconstruit par le BFF à partir d'une liste blanche</w:t>
             </w:r>
           </w:p>
         </w:tc>
@@ -8287,7 +11471,7 @@
                 <w:sz w:val="19"/>
                 <w:szCs w:val="19"/>
               </w:rPr>
-              <w:t xml:space="preserve">Mauvaise configuration ou compromission d'APIM</w:t>
+              <w:t xml:space="preserve">Mauvaise configuration ou compromission du BFF (APIM ou service Python)</w:t>
             </w:r>
           </w:p>
         </w:tc>
@@ -8319,7 +11503,7 @@
                 <w:sz w:val="19"/>
                 <w:szCs w:val="19"/>
               </w:rPr>
-              <w:t xml:space="preserve">Impact élevé (il échange tout jeton A reçu et peut déléguer n'importe quel utilisateur) : identité dédiée par rôle, policies versionnées et déployées par code, test de sécurité à chaque déploiement, supervision et alertes</w:t>
+              <w:t xml:space="preserve">Impact élevé (il échange tout jeton A reçu et peut déléguer n'importe quel utilisateur) : identité dédiée, policies ou code versionnés et déployés par code, test de sécurité à chaque déploiement, supervision et alertes</w:t>
             </w:r>
           </w:p>
         </w:tc>
@@ -8380,7 +11564,7 @@
         <w:t xml:space="preserve">Sessions Foundry non cloisonnées entre utilisateurs délégués</w:t>
       </w:r>
       <w:r>
-        <w:t xml:space="preserve"> : la passerelle impose une session par utilisateur (section 8). Tout nouveau point d'entrée vers l'agent doit appliquer la même règle.</w:t>
+        <w:t xml:space="preserve"> : le BFF impose une session par utilisateur (section 8). Tout nouveau point d'entrée vers l'agent doit appliquer la même règle.</w:t>
       </w:r>
     </w:p>
     <w:p>
@@ -8397,10 +11581,10 @@
           <w:b/>
           <w:bCs/>
         </w:rPr>
-        <w:t xml:space="preserve">Limitation de débit approximative</w:t>
-      </w:r>
-      <w:r>
-        <w:t xml:space="preserve"> : sur les tiers v2 d'API Management, les compteurs sont synchronisés de façon asynchrone ; la limite est indicative à quelques requêtes près.</w:t>
+        <w:t xml:space="preserve">Limitation de débit</w:t>
+      </w:r>
+      <w:r>
+        <w:t xml:space="preserve"> : sur les tiers v2 d'API Management, les compteurs sont synchronisés de façon asynchrone et la limite est indicative à quelques requêtes près ; le service Python est exact, mais limité à un réplica tant que cache et compteurs ne sont pas partagés.</w:t>
       </w:r>
     </w:p>
     <w:p>
@@ -8808,7 +11992,7 @@
         <w:t xml:space="preserve">joignables depuis Azure</w:t>
       </w:r>
       <w:r>
-        <w:t xml:space="preserve"> (API Management, agent, serveur MCP).</w:t>
+        <w:t xml:space="preserve"> (BFF, agent, serveur MCP).</w:t>
       </w:r>
     </w:p>
     <w:p>
@@ -9011,7 +12195,7 @@
                 <w:sz w:val="19"/>
                 <w:szCs w:val="19"/>
               </w:rPr>
-              <w:t xml:space="preserve"> : backend dédié à une application cliente, unique point d'entrée entre l'application et le reste du système. Ici implémenté par une API d'Azure API Management</w:t>
+              <w:t xml:space="preserve"> : backend dédié à une application cliente, unique point d'entrée entre l'application et le reste du système. Ici implémenté, au choix, par une API d'Azure API Management ou par un service Python (FastAPI) dans Azure Container Apps</w:t>
             </w:r>
           </w:p>
         </w:tc>
@@ -9856,7 +13040,7 @@
         </w:numPr>
         <w:spacing w:after="60"/>
       </w:pPr>
-      <w:hyperlink w:history="1" r:id="rId_kafmpeakpuotb1n_shsl">
+      <w:hyperlink w:history="1" r:id="rIdesnv1nhgdhuz-bwx-aaic">
         <w:r>
           <w:rPr>
             <w:rStyle w:val="Hyperlink"/>
@@ -9874,7 +13058,7 @@
         </w:numPr>
         <w:spacing w:after="60"/>
       </w:pPr>
-      <w:hyperlink w:history="1" r:id="rIdecfcy5omkli4a_psk2be6">
+      <w:hyperlink w:history="1" r:id="rId0kisxjh2vcvlkjcxy0xv1">
         <w:r>
           <w:rPr>
             <w:rStyle w:val="Hyperlink"/>
@@ -9892,7 +13076,7 @@
         </w:numPr>
         <w:spacing w:after="60"/>
       </w:pPr>
-      <w:hyperlink w:history="1" r:id="rIdiy-zqh_sek7twxhvk2oqq">
+      <w:hyperlink w:history="1" r:id="rIdgcbahx1_c7tbhqnofzn8m">
         <w:r>
           <w:rPr>
             <w:rStyle w:val="Hyperlink"/>
@@ -9910,7 +13094,25 @@
         </w:numPr>
         <w:spacing w:after="60"/>
       </w:pPr>
-      <w:hyperlink w:history="1" r:id="rId2b4ko4u-qwpzzkj-hg02m">
+      <w:hyperlink w:history="1" r:id="rIdsfalu0ohbkn7fqkg6hint">
+        <w:r>
+          <w:rPr>
+            <w:rStyle w:val="Hyperlink"/>
+          </w:rPr>
+          <w:t xml:space="preserve">Azure Container Apps : secrets et références Key Vault</w:t>
+        </w:r>
+      </w:hyperlink>
+    </w:p>
+    <w:p>
+      <w:pPr>
+        <w:pStyle w:val="ListParagraph"/>
+        <w:numPr>
+          <w:ilvl w:val="0"/>
+          <w:numId w:val="2"/>
+        </w:numPr>
+        <w:spacing w:after="60"/>
+      </w:pPr>
+      <w:hyperlink w:history="1" r:id="rId4snpvldmreky6vs8l6u3s">
         <w:r>
           <w:rPr>
             <w:rStyle w:val="Hyperlink"/>
@@ -9928,7 +13130,7 @@
         </w:numPr>
         <w:spacing w:after="60"/>
       </w:pPr>
-      <w:hyperlink w:history="1" r:id="rId5s60bdnove_mpvxe6u5ii">
+      <w:hyperlink w:history="1" r:id="rIdo3ppagfxpyisjnzhkcfdg">
         <w:r>
           <w:rPr>
             <w:rStyle w:val="Hyperlink"/>
@@ -9946,7 +13148,7 @@
         </w:numPr>
         <w:spacing w:after="60"/>
       </w:pPr>
-      <w:hyperlink w:history="1" r:id="rIde-sxjomowl4z8omehfmry">
+      <w:hyperlink w:history="1" r:id="rIdyiskwxe4irlaj2ojiofd5">
         <w:r>
           <w:rPr>
             <w:rStyle w:val="Hyperlink"/>
@@ -9964,7 +13166,7 @@
         </w:numPr>
         <w:spacing w:after="60"/>
       </w:pPr>
-      <w:hyperlink w:history="1" r:id="rId3q11r0wakpujlgmff83aw">
+      <w:hyperlink w:history="1" r:id="rId26ecyffgmnyslnmsecoyd">
         <w:r>
           <w:rPr>
             <w:rStyle w:val="Hyperlink"/>
@@ -9982,7 +13184,7 @@
         </w:numPr>
         <w:spacing w:after="60"/>
       </w:pPr>
-      <w:hyperlink w:history="1" r:id="rIdec69hxm87gmu2afrazmrr">
+      <w:hyperlink w:history="1" r:id="rIdjj2e0c0w2mmvpvglmq-ue">
         <w:r>
           <w:rPr>
             <w:rStyle w:val="Hyperlink"/>
@@ -10000,7 +13202,7 @@
         </w:numPr>
         <w:spacing w:after="60"/>
       </w:pPr>
-      <w:hyperlink w:history="1" r:id="rIdwte7apopkgoxpkfpptlfp">
+      <w:hyperlink w:history="1" r:id="rIdvumru-fdbh9oisjqfkcdp">
         <w:r>
           <w:rPr>
             <w:rStyle w:val="Hyperlink"/>

</xml_diff>